<commit_message>
docs: classify intake batch 7 by commercial and mission lanes
Record 69 source files representing 49 unique works and add market routes and Civic Continuum roles while preserving privacy, rights, evidence, and safety boundaries.
</commit_message>
<xml_diff>
--- a/docs/portfolio/zenodo/Mya_Brown_Zenodo_Master_Catalog_and_Development_Pipeline.docx
+++ b/docs/portfolio/zenodo/Mya_Brown_Zenodo_Master_Catalog_and_Development_Pipeline.docx
@@ -180,7 +180,7 @@
           </w:tcPr>
           <w:p>
             <w:r>
-              <w:t>59 files / 45 unique works (Batches 1–6)</w:t>
+              <w:t>69 files / 49 unique works (Batches 1–7)</w:t>
             </w:r>
           </w:p>
         </w:tc>
@@ -5881,15 +5881,15 @@
         <w:keepLines/>
       </w:pPr>
       <w:r>
-        <w:t>Local source-document intake — Batches 1 through 5</w:t>
-      </w:r>
-    </w:p>
-    <w:p>
-      <w:pPr>
-        <w:keepLines/>
-      </w:pPr>
-      <w:r>
-        <w:t>These fifty files were recovered directly from Mya P. Brown's Word/PDF archive on September 18, 2026. They represent thirty-nine unique works. Duplicate drafts, expanded versions, supplements, curriculum components, external references, support artifacts, and an empty placeholder are preserved without inflating the work count. They extend the working portfolio but do not increase the verified Zenodo count without an exact live record match. Public-release disposition is conservative: legal evidence, personal records, health material, technical designs, business plans, rights-restricted works, and insufficiently reviewed sources remain private.</w:t>
+        <w:t>Local source document intake Batches 1 through 7</w:t>
+      </w:r>
+    </w:p>
+    <w:p>
+      <w:pPr>
+        <w:keepLines/>
+      </w:pPr>
+      <w:r>
+        <w:t>These 69 files were recovered directly from Mya P. Brown's Word and PDF archive on September 18, 2026. They represent forty-nine unique works. Duplicate drafts, expanded versions, supplements, curriculum components, external references, protected evidence, support artifacts, and empty placeholders are preserved without inflating the work count. They extend the working portfolio but do not increase the verified Zenodo count without an exact live record match. Each item now includes a commercial route and Civic Continuum roadmap role. Public-release disposition remains conservative: legal evidence, personal records, health material, technical designs, business plans, rights-restricted works, and insufficiently reviewed sources remain private.</w:t>
       </w:r>
     </w:p>
     <w:p>
@@ -5975,6 +5975,34 @@
       <w:pPr>
         <w:keepLines/>
       </w:pPr>
+      <w:r>
+        <w:rPr>
+          <w:b/>
+        </w:rPr>
+        <w:t xml:space="preserve">Commercial route  </w:t>
+      </w:r>
+      <w:r>
+        <w:t>Publish as a sourced paper or brief; derive paid talks, workshops, consulting, licensing, or a reader-facing book only after review.</w:t>
+      </w:r>
+    </w:p>
+    <w:p>
+      <w:pPr>
+        <w:keepLines/>
+      </w:pPr>
+      <w:r>
+        <w:rPr>
+          <w:b/>
+        </w:rPr>
+        <w:t xml:space="preserve">Civic Continuum role  </w:t>
+      </w:r>
+      <w:r>
+        <w:t>Public framework lane: builds the Civic Continuum case for durable guardrails, shared reality, institutional memory, and stable self-governance.</w:t>
+      </w:r>
+    </w:p>
+    <w:p>
+      <w:pPr>
+        <w:keepLines/>
+      </w:pPr>
     </w:p>
     <w:p>
       <w:pPr>
@@ -6059,6 +6087,34 @@
       <w:pPr>
         <w:keepLines/>
       </w:pPr>
+      <w:r>
+        <w:rPr>
+          <w:b/>
+        </w:rPr>
+        <w:t xml:space="preserve">Commercial route  </w:t>
+      </w:r>
+      <w:r>
+        <w:t>Release as a bounded demonstrator, paid pilot, subscription, or enterprise license only after tests, consent controls, security review, and support are working.</w:t>
+      </w:r>
+    </w:p>
+    <w:p>
+      <w:pPr>
+        <w:keepLines/>
+      </w:pPr>
+      <w:r>
+        <w:rPr>
+          <w:b/>
+        </w:rPr>
+        <w:t xml:space="preserve">Civic Continuum role  </w:t>
+      </w:r>
+      <w:r>
+        <w:t>Physical proof lane: turns claims into measured prototypes, independent review, production evidence, and useful products.</w:t>
+      </w:r>
+    </w:p>
+    <w:p>
+      <w:pPr>
+        <w:keepLines/>
+      </w:pPr>
     </w:p>
     <w:p>
       <w:pPr>
@@ -6143,6 +6199,34 @@
       <w:pPr>
         <w:keepLines/>
       </w:pPr>
+      <w:r>
+        <w:rPr>
+          <w:b/>
+        </w:rPr>
+        <w:t xml:space="preserve">Commercial route  </w:t>
+      </w:r>
+      <w:r>
+        <w:t>Publish as a sourced paper or brief; derive paid talks, workshops, consulting, licensing, or a reader-facing book only after review.</w:t>
+      </w:r>
+    </w:p>
+    <w:p>
+      <w:pPr>
+        <w:keepLines/>
+      </w:pPr>
+      <w:r>
+        <w:rPr>
+          <w:b/>
+        </w:rPr>
+        <w:t xml:space="preserve">Civic Continuum role  </w:t>
+      </w:r>
+      <w:r>
+        <w:t>Portfolio support lane: preserves provenance, strengthens evidence, or supports delivery without overstating readiness.</w:t>
+      </w:r>
+    </w:p>
+    <w:p>
+      <w:pPr>
+        <w:keepLines/>
+      </w:pPr>
     </w:p>
     <w:p>
       <w:pPr>
@@ -6227,6 +6311,34 @@
       <w:pPr>
         <w:keepLines/>
       </w:pPr>
+      <w:r>
+        <w:rPr>
+          <w:b/>
+        </w:rPr>
+        <w:t xml:space="preserve">Commercial route  </w:t>
+      </w:r>
+      <w:r>
+        <w:t>Edit into a rights-cleared print, ebook, audiobook, music, or serialized edition with professional copyedit and launch metadata.</w:t>
+      </w:r>
+    </w:p>
+    <w:p>
+      <w:pPr>
+        <w:keepLines/>
+      </w:pPr>
+      <w:r>
+        <w:rPr>
+          <w:b/>
+        </w:rPr>
+        <w:t xml:space="preserve">Civic Continuum role  </w:t>
+      </w:r>
+      <w:r>
+        <w:t>Accountability practice lane: converts lived system failures into auditable methods, training, paid services, and institutional repair tools.</w:t>
+      </w:r>
+    </w:p>
+    <w:p>
+      <w:pPr>
+        <w:keepLines/>
+      </w:pPr>
     </w:p>
     <w:p>
       <w:pPr>
@@ -6311,6 +6423,34 @@
       <w:pPr>
         <w:keepLines/>
       </w:pPr>
+      <w:r>
+        <w:rPr>
+          <w:b/>
+        </w:rPr>
+        <w:t xml:space="preserve">Commercial route  </w:t>
+      </w:r>
+      <w:r>
+        <w:t>Edit into a rights-cleared print, ebook, audiobook, music, or serialized edition with professional copyedit and launch metadata.</w:t>
+      </w:r>
+    </w:p>
+    <w:p>
+      <w:pPr>
+        <w:keepLines/>
+      </w:pPr>
+      <w:r>
+        <w:rPr>
+          <w:b/>
+        </w:rPr>
+        <w:t xml:space="preserve">Civic Continuum role  </w:t>
+      </w:r>
+      <w:r>
+        <w:t>Accountability practice lane: converts lived system failures into auditable methods, training, paid services, and institutional repair tools.</w:t>
+      </w:r>
+    </w:p>
+    <w:p>
+      <w:pPr>
+        <w:keepLines/>
+      </w:pPr>
     </w:p>
     <w:p>
       <w:pPr>
@@ -6395,6 +6535,34 @@
       <w:pPr>
         <w:keepLines/>
       </w:pPr>
+      <w:r>
+        <w:rPr>
+          <w:b/>
+        </w:rPr>
+        <w:t xml:space="preserve">Commercial route  </w:t>
+      </w:r>
+      <w:r>
+        <w:t>Advance through prior art, requirements, simulation or bench proof, safety review, prototype, pilot, manufacturing, and truthful product launch.</w:t>
+      </w:r>
+    </w:p>
+    <w:p>
+      <w:pPr>
+        <w:keepLines/>
+      </w:pPr>
+      <w:r>
+        <w:rPr>
+          <w:b/>
+        </w:rPr>
+        <w:t xml:space="preserve">Civic Continuum role  </w:t>
+      </w:r>
+      <w:r>
+        <w:t>Physical proof lane: turns claims into measured prototypes, independent review, production evidence, and useful products.</w:t>
+      </w:r>
+    </w:p>
+    <w:p>
+      <w:pPr>
+        <w:keepLines/>
+      </w:pPr>
     </w:p>
     <w:p>
       <w:pPr>
@@ -6479,6 +6647,34 @@
       <w:pPr>
         <w:keepLines/>
       </w:pPr>
+      <w:r>
+        <w:rPr>
+          <w:b/>
+        </w:rPr>
+        <w:t xml:space="preserve">Commercial route  </w:t>
+      </w:r>
+      <w:r>
+        <w:t>Edit into a rights-cleared print, ebook, audiobook, music, or serialized edition with professional copyedit and launch metadata.</w:t>
+      </w:r>
+    </w:p>
+    <w:p>
+      <w:pPr>
+        <w:keepLines/>
+      </w:pPr>
+      <w:r>
+        <w:rPr>
+          <w:b/>
+        </w:rPr>
+        <w:t xml:space="preserve">Civic Continuum role  </w:t>
+      </w:r>
+      <w:r>
+        <w:t>Physical proof lane: turns claims into measured prototypes, independent review, production evidence, and useful products.</w:t>
+      </w:r>
+    </w:p>
+    <w:p>
+      <w:pPr>
+        <w:keepLines/>
+      </w:pPr>
     </w:p>
     <w:p>
       <w:pPr>
@@ -6563,6 +6759,34 @@
       <w:pPr>
         <w:keepLines/>
       </w:pPr>
+      <w:r>
+        <w:rPr>
+          <w:b/>
+        </w:rPr>
+        <w:t xml:space="preserve">Commercial route  </w:t>
+      </w:r>
+      <w:r>
+        <w:t>Sell as a rights-cleared workbook, facilitator kit, cohort course, institutional license, or consulting package after review and pilot evidence.</w:t>
+      </w:r>
+    </w:p>
+    <w:p>
+      <w:pPr>
+        <w:keepLines/>
+      </w:pPr>
+      <w:r>
+        <w:rPr>
+          <w:b/>
+        </w:rPr>
+        <w:t xml:space="preserve">Civic Continuum role  </w:t>
+      </w:r>
+      <w:r>
+        <w:t>Audience and revenue lane: funds the mission, teaches the framework, and builds trust through useful rights-cleared products.</w:t>
+      </w:r>
+    </w:p>
+    <w:p>
+      <w:pPr>
+        <w:keepLines/>
+      </w:pPr>
     </w:p>
     <w:p>
       <w:pPr>
@@ -6647,6 +6871,34 @@
       <w:pPr>
         <w:keepLines/>
       </w:pPr>
+      <w:r>
+        <w:rPr>
+          <w:b/>
+        </w:rPr>
+        <w:t xml:space="preserve">Commercial route  </w:t>
+      </w:r>
+      <w:r>
+        <w:t>Publish as a sourced paper or brief; derive paid talks, workshops, consulting, licensing, or a reader-facing book only after review.</w:t>
+      </w:r>
+    </w:p>
+    <w:p>
+      <w:pPr>
+        <w:keepLines/>
+      </w:pPr>
+      <w:r>
+        <w:rPr>
+          <w:b/>
+        </w:rPr>
+        <w:t xml:space="preserve">Civic Continuum role  </w:t>
+      </w:r>
+      <w:r>
+        <w:t>Portfolio support lane: preserves provenance, strengthens evidence, or supports delivery without overstating readiness.</w:t>
+      </w:r>
+    </w:p>
+    <w:p>
+      <w:pPr>
+        <w:keepLines/>
+      </w:pPr>
     </w:p>
     <w:p>
       <w:pPr>
@@ -6731,6 +6983,34 @@
       <w:pPr>
         <w:keepLines/>
       </w:pPr>
+      <w:r>
+        <w:rPr>
+          <w:b/>
+        </w:rPr>
+        <w:t xml:space="preserve">Commercial route  </w:t>
+      </w:r>
+      <w:r>
+        <w:t>Edit into a rights-cleared print, ebook, audiobook, music, or serialized edition with professional copyedit and launch metadata.</w:t>
+      </w:r>
+    </w:p>
+    <w:p>
+      <w:pPr>
+        <w:keepLines/>
+      </w:pPr>
+      <w:r>
+        <w:rPr>
+          <w:b/>
+        </w:rPr>
+        <w:t xml:space="preserve">Civic Continuum role  </w:t>
+      </w:r>
+      <w:r>
+        <w:t>Portfolio support lane: preserves provenance, strengthens evidence, or supports delivery without overstating readiness.</w:t>
+      </w:r>
+    </w:p>
+    <w:p>
+      <w:pPr>
+        <w:keepLines/>
+      </w:pPr>
     </w:p>
     <w:p>
       <w:pPr>
@@ -6815,6 +7095,34 @@
       <w:pPr>
         <w:keepLines/>
       </w:pPr>
+      <w:r>
+        <w:rPr>
+          <w:b/>
+        </w:rPr>
+        <w:t xml:space="preserve">Commercial route  </w:t>
+      </w:r>
+      <w:r>
+        <w:t>Package only after audience, rights, evidence, safety, and delivery format are defined.</w:t>
+      </w:r>
+    </w:p>
+    <w:p>
+      <w:pPr>
+        <w:keepLines/>
+      </w:pPr>
+      <w:r>
+        <w:rPr>
+          <w:b/>
+        </w:rPr>
+        <w:t xml:space="preserve">Civic Continuum role  </w:t>
+      </w:r>
+      <w:r>
+        <w:t>Portfolio support lane: preserves provenance, strengthens evidence, or supports delivery without overstating readiness.</w:t>
+      </w:r>
+    </w:p>
+    <w:p>
+      <w:pPr>
+        <w:keepLines/>
+      </w:pPr>
     </w:p>
     <w:p>
       <w:pPr>
@@ -6899,6 +7207,34 @@
       <w:pPr>
         <w:keepLines/>
       </w:pPr>
+      <w:r>
+        <w:rPr>
+          <w:b/>
+        </w:rPr>
+        <w:t xml:space="preserve">Commercial route  </w:t>
+      </w:r>
+      <w:r>
+        <w:t>Edit into a rights-cleared print, ebook, audiobook, music, or serialized edition with professional copyedit and launch metadata.</w:t>
+      </w:r>
+    </w:p>
+    <w:p>
+      <w:pPr>
+        <w:keepLines/>
+      </w:pPr>
+      <w:r>
+        <w:rPr>
+          <w:b/>
+        </w:rPr>
+        <w:t xml:space="preserve">Civic Continuum role  </w:t>
+      </w:r>
+      <w:r>
+        <w:t>Audience and revenue lane: funds the mission, teaches the framework, and builds trust through useful rights-cleared products.</w:t>
+      </w:r>
+    </w:p>
+    <w:p>
+      <w:pPr>
+        <w:keepLines/>
+      </w:pPr>
     </w:p>
     <w:p>
       <w:pPr>
@@ -6983,6 +7319,34 @@
       <w:pPr>
         <w:keepLines/>
       </w:pPr>
+      <w:r>
+        <w:rPr>
+          <w:b/>
+        </w:rPr>
+        <w:t xml:space="preserve">Commercial route  </w:t>
+      </w:r>
+      <w:r>
+        <w:t>Package only after audience, rights, evidence, safety, and delivery format are defined.</w:t>
+      </w:r>
+    </w:p>
+    <w:p>
+      <w:pPr>
+        <w:keepLines/>
+      </w:pPr>
+      <w:r>
+        <w:rPr>
+          <w:b/>
+        </w:rPr>
+        <w:t xml:space="preserve">Civic Continuum role  </w:t>
+      </w:r>
+      <w:r>
+        <w:t>Portfolio support lane: preserves provenance, strengthens evidence, or supports delivery without overstating readiness.</w:t>
+      </w:r>
+    </w:p>
+    <w:p>
+      <w:pPr>
+        <w:keepLines/>
+      </w:pPr>
     </w:p>
     <w:p>
       <w:pPr>
@@ -7067,6 +7431,34 @@
       <w:pPr>
         <w:keepLines/>
       </w:pPr>
+      <w:r>
+        <w:rPr>
+          <w:b/>
+        </w:rPr>
+        <w:t xml:space="preserve">Commercial route  </w:t>
+      </w:r>
+      <w:r>
+        <w:t>Package only after audience, rights, evidence, safety, and delivery format are defined.</w:t>
+      </w:r>
+    </w:p>
+    <w:p>
+      <w:pPr>
+        <w:keepLines/>
+      </w:pPr>
+      <w:r>
+        <w:rPr>
+          <w:b/>
+        </w:rPr>
+        <w:t xml:space="preserve">Civic Continuum role  </w:t>
+      </w:r>
+      <w:r>
+        <w:t>Portfolio support lane: preserves provenance, strengthens evidence, or supports delivery without overstating readiness.</w:t>
+      </w:r>
+    </w:p>
+    <w:p>
+      <w:pPr>
+        <w:keepLines/>
+      </w:pPr>
     </w:p>
     <w:p>
       <w:pPr>
@@ -7151,6 +7543,34 @@
       <w:pPr>
         <w:keepLines/>
       </w:pPr>
+      <w:r>
+        <w:rPr>
+          <w:b/>
+        </w:rPr>
+        <w:t xml:space="preserve">Commercial route  </w:t>
+      </w:r>
+      <w:r>
+        <w:t>Publish as a sourced paper or brief; derive paid talks, workshops, consulting, licensing, or a reader-facing book only after review.</w:t>
+      </w:r>
+    </w:p>
+    <w:p>
+      <w:pPr>
+        <w:keepLines/>
+      </w:pPr>
+      <w:r>
+        <w:rPr>
+          <w:b/>
+        </w:rPr>
+        <w:t xml:space="preserve">Civic Continuum role  </w:t>
+      </w:r>
+      <w:r>
+        <w:t>Portfolio support lane: preserves provenance, strengthens evidence, or supports delivery without overstating readiness.</w:t>
+      </w:r>
+    </w:p>
+    <w:p>
+      <w:pPr>
+        <w:keepLines/>
+      </w:pPr>
     </w:p>
     <w:p>
       <w:pPr>
@@ -7235,6 +7655,34 @@
       <w:pPr>
         <w:keepLines/>
       </w:pPr>
+      <w:r>
+        <w:rPr>
+          <w:b/>
+        </w:rPr>
+        <w:t xml:space="preserve">Commercial route  </w:t>
+      </w:r>
+      <w:r>
+        <w:t>Publish as a sourced paper or brief; derive paid talks, workshops, consulting, licensing, or a reader-facing book only after review.</w:t>
+      </w:r>
+    </w:p>
+    <w:p>
+      <w:pPr>
+        <w:keepLines/>
+      </w:pPr>
+      <w:r>
+        <w:rPr>
+          <w:b/>
+        </w:rPr>
+        <w:t xml:space="preserve">Civic Continuum role  </w:t>
+      </w:r>
+      <w:r>
+        <w:t>Portfolio support lane: preserves provenance, strengthens evidence, or supports delivery without overstating readiness.</w:t>
+      </w:r>
+    </w:p>
+    <w:p>
+      <w:pPr>
+        <w:keepLines/>
+      </w:pPr>
     </w:p>
     <w:p>
       <w:pPr>
@@ -7319,6 +7767,34 @@
       <w:pPr>
         <w:keepLines/>
       </w:pPr>
+      <w:r>
+        <w:rPr>
+          <w:b/>
+        </w:rPr>
+        <w:t xml:space="preserve">Commercial route  </w:t>
+      </w:r>
+      <w:r>
+        <w:t>Publish as a sourced paper or brief; derive paid talks, workshops, consulting, licensing, or a reader-facing book only after review.</w:t>
+      </w:r>
+    </w:p>
+    <w:p>
+      <w:pPr>
+        <w:keepLines/>
+      </w:pPr>
+      <w:r>
+        <w:rPr>
+          <w:b/>
+        </w:rPr>
+        <w:t xml:space="preserve">Civic Continuum role  </w:t>
+      </w:r>
+      <w:r>
+        <w:t>Portfolio support lane: preserves provenance, strengthens evidence, or supports delivery without overstating readiness.</w:t>
+      </w:r>
+    </w:p>
+    <w:p>
+      <w:pPr>
+        <w:keepLines/>
+      </w:pPr>
     </w:p>
     <w:p>
       <w:pPr>
@@ -7403,6 +7879,34 @@
       <w:pPr>
         <w:keepLines/>
       </w:pPr>
+      <w:r>
+        <w:rPr>
+          <w:b/>
+        </w:rPr>
+        <w:t xml:space="preserve">Commercial route  </w:t>
+      </w:r>
+      <w:r>
+        <w:t>Package only after audience, rights, evidence, safety, and delivery format are defined.</w:t>
+      </w:r>
+    </w:p>
+    <w:p>
+      <w:pPr>
+        <w:keepLines/>
+      </w:pPr>
+      <w:r>
+        <w:rPr>
+          <w:b/>
+        </w:rPr>
+        <w:t xml:space="preserve">Civic Continuum role  </w:t>
+      </w:r>
+      <w:r>
+        <w:t>Portfolio support lane: preserves provenance, strengthens evidence, or supports delivery without overstating readiness.</w:t>
+      </w:r>
+    </w:p>
+    <w:p>
+      <w:pPr>
+        <w:keepLines/>
+      </w:pPr>
     </w:p>
     <w:p>
       <w:pPr>
@@ -7487,6 +7991,34 @@
       <w:pPr>
         <w:keepLines/>
       </w:pPr>
+      <w:r>
+        <w:rPr>
+          <w:b/>
+        </w:rPr>
+        <w:t xml:space="preserve">Commercial route  </w:t>
+      </w:r>
+      <w:r>
+        <w:t>Advance through prior art, requirements, simulation or bench proof, safety review, prototype, pilot, manufacturing, and truthful product launch.</w:t>
+      </w:r>
+    </w:p>
+    <w:p>
+      <w:pPr>
+        <w:keepLines/>
+      </w:pPr>
+      <w:r>
+        <w:rPr>
+          <w:b/>
+        </w:rPr>
+        <w:t xml:space="preserve">Civic Continuum role  </w:t>
+      </w:r>
+      <w:r>
+        <w:t>Physical proof lane: turns claims into measured prototypes, independent review, production evidence, and useful products.</w:t>
+      </w:r>
+    </w:p>
+    <w:p>
+      <w:pPr>
+        <w:keepLines/>
+      </w:pPr>
     </w:p>
     <w:p>
       <w:pPr>
@@ -7571,6 +8103,34 @@
       <w:pPr>
         <w:keepLines/>
       </w:pPr>
+      <w:r>
+        <w:rPr>
+          <w:b/>
+        </w:rPr>
+        <w:t xml:space="preserve">Commercial route  </w:t>
+      </w:r>
+      <w:r>
+        <w:t>Use privately for venture validation, partner outreach, and operating decisions; publish only a sanitized prospectus if useful.</w:t>
+      </w:r>
+    </w:p>
+    <w:p>
+      <w:pPr>
+        <w:keepLines/>
+      </w:pPr>
+      <w:r>
+        <w:rPr>
+          <w:b/>
+        </w:rPr>
+        <w:t xml:space="preserve">Civic Continuum role  </w:t>
+      </w:r>
+      <w:r>
+        <w:t>Portfolio support lane: preserves provenance, strengthens evidence, or supports delivery without overstating readiness.</w:t>
+      </w:r>
+    </w:p>
+    <w:p>
+      <w:pPr>
+        <w:keepLines/>
+      </w:pPr>
     </w:p>
     <w:p>
       <w:pPr>
@@ -7655,6 +8215,34 @@
       <w:pPr>
         <w:keepLines/>
       </w:pPr>
+      <w:r>
+        <w:rPr>
+          <w:b/>
+        </w:rPr>
+        <w:t xml:space="preserve">Commercial route  </w:t>
+      </w:r>
+      <w:r>
+        <w:t>Publish as a sourced paper or brief; derive paid talks, workshops, consulting, licensing, or a reader-facing book only after review.</w:t>
+      </w:r>
+    </w:p>
+    <w:p>
+      <w:pPr>
+        <w:keepLines/>
+      </w:pPr>
+      <w:r>
+        <w:rPr>
+          <w:b/>
+        </w:rPr>
+        <w:t xml:space="preserve">Civic Continuum role  </w:t>
+      </w:r>
+      <w:r>
+        <w:t>Physical proof lane: turns claims into measured prototypes, independent review, production evidence, and useful products.</w:t>
+      </w:r>
+    </w:p>
+    <w:p>
+      <w:pPr>
+        <w:keepLines/>
+      </w:pPr>
     </w:p>
     <w:p>
       <w:pPr>
@@ -7739,6 +8327,34 @@
       <w:pPr>
         <w:keepLines/>
       </w:pPr>
+      <w:r>
+        <w:rPr>
+          <w:b/>
+        </w:rPr>
+        <w:t xml:space="preserve">Commercial route  </w:t>
+      </w:r>
+      <w:r>
+        <w:t>Use privately for venture validation, partner outreach, and operating decisions; publish only a sanitized prospectus if useful.</w:t>
+      </w:r>
+    </w:p>
+    <w:p>
+      <w:pPr>
+        <w:keepLines/>
+      </w:pPr>
+      <w:r>
+        <w:rPr>
+          <w:b/>
+        </w:rPr>
+        <w:t xml:space="preserve">Civic Continuum role  </w:t>
+      </w:r>
+      <w:r>
+        <w:t>Portfolio support lane: preserves provenance, strengthens evidence, or supports delivery without overstating readiness.</w:t>
+      </w:r>
+    </w:p>
+    <w:p>
+      <w:pPr>
+        <w:keepLines/>
+      </w:pPr>
     </w:p>
     <w:p>
       <w:pPr>
@@ -7823,6 +8439,34 @@
       <w:pPr>
         <w:keepLines/>
       </w:pPr>
+      <w:r>
+        <w:rPr>
+          <w:b/>
+        </w:rPr>
+        <w:t xml:space="preserve">Commercial route  </w:t>
+      </w:r>
+      <w:r>
+        <w:t>Edit into a rights-cleared print, ebook, audiobook, music, or serialized edition with professional copyedit and launch metadata.</w:t>
+      </w:r>
+    </w:p>
+    <w:p>
+      <w:pPr>
+        <w:keepLines/>
+      </w:pPr>
+      <w:r>
+        <w:rPr>
+          <w:b/>
+        </w:rPr>
+        <w:t xml:space="preserve">Civic Continuum role  </w:t>
+      </w:r>
+      <w:r>
+        <w:t>Audience and revenue lane: funds the mission, teaches the framework, and builds trust through useful rights-cleared products.</w:t>
+      </w:r>
+    </w:p>
+    <w:p>
+      <w:pPr>
+        <w:keepLines/>
+      </w:pPr>
     </w:p>
     <w:p>
       <w:pPr>
@@ -7907,6 +8551,34 @@
       <w:pPr>
         <w:keepLines/>
       </w:pPr>
+      <w:r>
+        <w:rPr>
+          <w:b/>
+        </w:rPr>
+        <w:t xml:space="preserve">Commercial route  </w:t>
+      </w:r>
+      <w:r>
+        <w:t>Publish as a sourced paper or brief; derive paid talks, workshops, consulting, licensing, or a reader-facing book only after review.</w:t>
+      </w:r>
+    </w:p>
+    <w:p>
+      <w:pPr>
+        <w:keepLines/>
+      </w:pPr>
+      <w:r>
+        <w:rPr>
+          <w:b/>
+        </w:rPr>
+        <w:t xml:space="preserve">Civic Continuum role  </w:t>
+      </w:r>
+      <w:r>
+        <w:t>Portfolio support lane: preserves provenance, strengthens evidence, or supports delivery without overstating readiness.</w:t>
+      </w:r>
+    </w:p>
+    <w:p>
+      <w:pPr>
+        <w:keepLines/>
+      </w:pPr>
     </w:p>
     <w:p>
       <w:pPr>
@@ -7991,6 +8663,34 @@
       <w:pPr>
         <w:keepLines/>
       </w:pPr>
+      <w:r>
+        <w:rPr>
+          <w:b/>
+        </w:rPr>
+        <w:t xml:space="preserve">Commercial route  </w:t>
+      </w:r>
+      <w:r>
+        <w:t>Use privately for venture validation, partner outreach, and operating decisions; publish only a sanitized prospectus if useful.</w:t>
+      </w:r>
+    </w:p>
+    <w:p>
+      <w:pPr>
+        <w:keepLines/>
+      </w:pPr>
+      <w:r>
+        <w:rPr>
+          <w:b/>
+        </w:rPr>
+        <w:t xml:space="preserve">Civic Continuum role  </w:t>
+      </w:r>
+      <w:r>
+        <w:t>Portfolio support lane: preserves provenance, strengthens evidence, or supports delivery without overstating readiness.</w:t>
+      </w:r>
+    </w:p>
+    <w:p>
+      <w:pPr>
+        <w:keepLines/>
+      </w:pPr>
     </w:p>
     <w:p>
       <w:pPr>
@@ -8075,6 +8775,34 @@
       <w:pPr>
         <w:keepLines/>
       </w:pPr>
+      <w:r>
+        <w:rPr>
+          <w:b/>
+        </w:rPr>
+        <w:t xml:space="preserve">Commercial route  </w:t>
+      </w:r>
+      <w:r>
+        <w:t>Archive or protected source only; no direct sale.</w:t>
+      </w:r>
+    </w:p>
+    <w:p>
+      <w:pPr>
+        <w:keepLines/>
+      </w:pPr>
+      <w:r>
+        <w:rPr>
+          <w:b/>
+        </w:rPr>
+        <w:t xml:space="preserve">Civic Continuum role  </w:t>
+      </w:r>
+      <w:r>
+        <w:t>Physical proof lane: turns claims into measured prototypes, independent review, production evidence, and useful products.</w:t>
+      </w:r>
+    </w:p>
+    <w:p>
+      <w:pPr>
+        <w:keepLines/>
+      </w:pPr>
     </w:p>
     <w:p>
       <w:pPr>
@@ -8159,6 +8887,34 @@
       <w:pPr>
         <w:keepLines/>
       </w:pPr>
+      <w:r>
+        <w:rPr>
+          <w:b/>
+        </w:rPr>
+        <w:t xml:space="preserve">Commercial route  </w:t>
+      </w:r>
+      <w:r>
+        <w:t>Edit into a rights-cleared print, ebook, audiobook, music, or serialized edition with professional copyedit and launch metadata.</w:t>
+      </w:r>
+    </w:p>
+    <w:p>
+      <w:pPr>
+        <w:keepLines/>
+      </w:pPr>
+      <w:r>
+        <w:rPr>
+          <w:b/>
+        </w:rPr>
+        <w:t xml:space="preserve">Civic Continuum role  </w:t>
+      </w:r>
+      <w:r>
+        <w:t>Accountability practice lane: converts lived system failures into auditable methods, training, paid services, and institutional repair tools.</w:t>
+      </w:r>
+    </w:p>
+    <w:p>
+      <w:pPr>
+        <w:keepLines/>
+      </w:pPr>
     </w:p>
     <w:p>
       <w:pPr>
@@ -8243,6 +8999,34 @@
       <w:pPr>
         <w:keepLines/>
       </w:pPr>
+      <w:r>
+        <w:rPr>
+          <w:b/>
+        </w:rPr>
+        <w:t xml:space="preserve">Commercial route  </w:t>
+      </w:r>
+      <w:r>
+        <w:t>Publish as a sourced paper or brief; derive paid talks, workshops, consulting, licensing, or a reader-facing book only after review.</w:t>
+      </w:r>
+    </w:p>
+    <w:p>
+      <w:pPr>
+        <w:keepLines/>
+      </w:pPr>
+      <w:r>
+        <w:rPr>
+          <w:b/>
+        </w:rPr>
+        <w:t xml:space="preserve">Civic Continuum role  </w:t>
+      </w:r>
+      <w:r>
+        <w:t>Portfolio support lane: preserves provenance, strengthens evidence, or supports delivery without overstating readiness.</w:t>
+      </w:r>
+    </w:p>
+    <w:p>
+      <w:pPr>
+        <w:keepLines/>
+      </w:pPr>
     </w:p>
     <w:p>
       <w:pPr>
@@ -8327,6 +9111,34 @@
       <w:pPr>
         <w:keepLines/>
       </w:pPr>
+      <w:r>
+        <w:rPr>
+          <w:b/>
+        </w:rPr>
+        <w:t xml:space="preserve">Commercial route  </w:t>
+      </w:r>
+      <w:r>
+        <w:t>Publish as a sourced paper or brief; derive paid talks, workshops, consulting, licensing, or a reader-facing book only after review.</w:t>
+      </w:r>
+    </w:p>
+    <w:p>
+      <w:pPr>
+        <w:keepLines/>
+      </w:pPr>
+      <w:r>
+        <w:rPr>
+          <w:b/>
+        </w:rPr>
+        <w:t xml:space="preserve">Civic Continuum role  </w:t>
+      </w:r>
+      <w:r>
+        <w:t>Portfolio support lane: preserves provenance, strengthens evidence, or supports delivery without overstating readiness.</w:t>
+      </w:r>
+    </w:p>
+    <w:p>
+      <w:pPr>
+        <w:keepLines/>
+      </w:pPr>
     </w:p>
     <w:p>
       <w:pPr>
@@ -8411,6 +9223,34 @@
       <w:pPr>
         <w:keepLines/>
       </w:pPr>
+      <w:r>
+        <w:rPr>
+          <w:b/>
+        </w:rPr>
+        <w:t xml:space="preserve">Commercial route  </w:t>
+      </w:r>
+      <w:r>
+        <w:t>Package only after audience, rights, evidence, safety, and delivery format are defined.</w:t>
+      </w:r>
+    </w:p>
+    <w:p>
+      <w:pPr>
+        <w:keepLines/>
+      </w:pPr>
+      <w:r>
+        <w:rPr>
+          <w:b/>
+        </w:rPr>
+        <w:t xml:space="preserve">Civic Continuum role  </w:t>
+      </w:r>
+      <w:r>
+        <w:t>Portfolio support lane: preserves provenance, strengthens evidence, or supports delivery without overstating readiness.</w:t>
+      </w:r>
+    </w:p>
+    <w:p>
+      <w:pPr>
+        <w:keepLines/>
+      </w:pPr>
     </w:p>
     <w:p>
       <w:pPr>
@@ -8495,6 +9335,34 @@
       <w:pPr>
         <w:keepLines/>
       </w:pPr>
+      <w:r>
+        <w:rPr>
+          <w:b/>
+        </w:rPr>
+        <w:t xml:space="preserve">Commercial route  </w:t>
+      </w:r>
+      <w:r>
+        <w:t>Sell as a rights-cleared workbook, facilitator kit, cohort course, institutional license, or consulting package after review and pilot evidence.</w:t>
+      </w:r>
+    </w:p>
+    <w:p>
+      <w:pPr>
+        <w:keepLines/>
+      </w:pPr>
+      <w:r>
+        <w:rPr>
+          <w:b/>
+        </w:rPr>
+        <w:t xml:space="preserve">Civic Continuum role  </w:t>
+      </w:r>
+      <w:r>
+        <w:t>Physical proof lane: turns claims into measured prototypes, independent review, production evidence, and useful products.</w:t>
+      </w:r>
+    </w:p>
+    <w:p>
+      <w:pPr>
+        <w:keepLines/>
+      </w:pPr>
     </w:p>
     <w:p>
       <w:pPr>
@@ -8579,6 +9447,34 @@
       <w:pPr>
         <w:keepLines/>
       </w:pPr>
+      <w:r>
+        <w:rPr>
+          <w:b/>
+        </w:rPr>
+        <w:t xml:space="preserve">Commercial route  </w:t>
+      </w:r>
+      <w:r>
+        <w:t>Sell as a rights-cleared workbook, facilitator kit, cohort course, institutional license, or consulting package after review and pilot evidence.</w:t>
+      </w:r>
+    </w:p>
+    <w:p>
+      <w:pPr>
+        <w:keepLines/>
+      </w:pPr>
+      <w:r>
+        <w:rPr>
+          <w:b/>
+        </w:rPr>
+        <w:t xml:space="preserve">Civic Continuum role  </w:t>
+      </w:r>
+      <w:r>
+        <w:t>Audience and revenue lane: funds the mission, teaches the framework, and builds trust through useful rights-cleared products.</w:t>
+      </w:r>
+    </w:p>
+    <w:p>
+      <w:pPr>
+        <w:keepLines/>
+      </w:pPr>
     </w:p>
     <w:p>
       <w:pPr>
@@ -8663,6 +9559,34 @@
       <w:pPr>
         <w:keepLines/>
       </w:pPr>
+      <w:r>
+        <w:rPr>
+          <w:b/>
+        </w:rPr>
+        <w:t xml:space="preserve">Commercial route  </w:t>
+      </w:r>
+      <w:r>
+        <w:t>Sell as a rights-cleared workbook, facilitator kit, cohort course, institutional license, or consulting package after review and pilot evidence.</w:t>
+      </w:r>
+    </w:p>
+    <w:p>
+      <w:pPr>
+        <w:keepLines/>
+      </w:pPr>
+      <w:r>
+        <w:rPr>
+          <w:b/>
+        </w:rPr>
+        <w:t xml:space="preserve">Civic Continuum role  </w:t>
+      </w:r>
+      <w:r>
+        <w:t>Portfolio support lane: preserves provenance, strengthens evidence, or supports delivery without overstating readiness.</w:t>
+      </w:r>
+    </w:p>
+    <w:p>
+      <w:pPr>
+        <w:keepLines/>
+      </w:pPr>
     </w:p>
     <w:p>
       <w:pPr>
@@ -8747,6 +9671,34 @@
       <w:pPr>
         <w:keepLines/>
       </w:pPr>
+      <w:r>
+        <w:rPr>
+          <w:b/>
+        </w:rPr>
+        <w:t xml:space="preserve">Commercial route  </w:t>
+      </w:r>
+      <w:r>
+        <w:t>Sell as a rights-cleared workbook, facilitator kit, cohort course, institutional license, or consulting package after review and pilot evidence.</w:t>
+      </w:r>
+    </w:p>
+    <w:p>
+      <w:pPr>
+        <w:keepLines/>
+      </w:pPr>
+      <w:r>
+        <w:rPr>
+          <w:b/>
+        </w:rPr>
+        <w:t xml:space="preserve">Civic Continuum role  </w:t>
+      </w:r>
+      <w:r>
+        <w:t>Audience and revenue lane: funds the mission, teaches the framework, and builds trust through useful rights-cleared products.</w:t>
+      </w:r>
+    </w:p>
+    <w:p>
+      <w:pPr>
+        <w:keepLines/>
+      </w:pPr>
     </w:p>
     <w:p>
       <w:pPr>
@@ -8831,6 +9783,34 @@
       <w:pPr>
         <w:keepLines/>
       </w:pPr>
+      <w:r>
+        <w:rPr>
+          <w:b/>
+        </w:rPr>
+        <w:t xml:space="preserve">Commercial route  </w:t>
+      </w:r>
+      <w:r>
+        <w:t>Publish as a sourced paper or brief; derive paid talks, workshops, consulting, licensing, or a reader-facing book only after review.</w:t>
+      </w:r>
+    </w:p>
+    <w:p>
+      <w:pPr>
+        <w:keepLines/>
+      </w:pPr>
+      <w:r>
+        <w:rPr>
+          <w:b/>
+        </w:rPr>
+        <w:t xml:space="preserve">Civic Continuum role  </w:t>
+      </w:r>
+      <w:r>
+        <w:t>Portfolio support lane: preserves provenance, strengthens evidence, or supports delivery without overstating readiness.</w:t>
+      </w:r>
+    </w:p>
+    <w:p>
+      <w:pPr>
+        <w:keepLines/>
+      </w:pPr>
     </w:p>
     <w:p>
       <w:pPr>
@@ -8915,6 +9895,34 @@
       <w:pPr>
         <w:keepLines/>
       </w:pPr>
+      <w:r>
+        <w:rPr>
+          <w:b/>
+        </w:rPr>
+        <w:t xml:space="preserve">Commercial route  </w:t>
+      </w:r>
+      <w:r>
+        <w:t>Package only after audience, rights, evidence, safety, and delivery format are defined.</w:t>
+      </w:r>
+    </w:p>
+    <w:p>
+      <w:pPr>
+        <w:keepLines/>
+      </w:pPr>
+      <w:r>
+        <w:rPr>
+          <w:b/>
+        </w:rPr>
+        <w:t xml:space="preserve">Civic Continuum role  </w:t>
+      </w:r>
+      <w:r>
+        <w:t>Portfolio support lane: preserves provenance, strengthens evidence, or supports delivery without overstating readiness.</w:t>
+      </w:r>
+    </w:p>
+    <w:p>
+      <w:pPr>
+        <w:keepLines/>
+      </w:pPr>
     </w:p>
     <w:p>
       <w:pPr>
@@ -8999,6 +10007,34 @@
       <w:pPr>
         <w:keepLines/>
       </w:pPr>
+      <w:r>
+        <w:rPr>
+          <w:b/>
+        </w:rPr>
+        <w:t xml:space="preserve">Commercial route  </w:t>
+      </w:r>
+      <w:r>
+        <w:t>Publish as a sourced paper or brief; derive paid talks, workshops, consulting, licensing, or a reader-facing book only after review.</w:t>
+      </w:r>
+    </w:p>
+    <w:p>
+      <w:pPr>
+        <w:keepLines/>
+      </w:pPr>
+      <w:r>
+        <w:rPr>
+          <w:b/>
+        </w:rPr>
+        <w:t xml:space="preserve">Civic Continuum role  </w:t>
+      </w:r>
+      <w:r>
+        <w:t>Portfolio support lane: preserves provenance, strengthens evidence, or supports delivery without overstating readiness.</w:t>
+      </w:r>
+    </w:p>
+    <w:p>
+      <w:pPr>
+        <w:keepLines/>
+      </w:pPr>
     </w:p>
     <w:p>
       <w:pPr>
@@ -9083,6 +10119,34 @@
       <w:pPr>
         <w:keepLines/>
       </w:pPr>
+      <w:r>
+        <w:rPr>
+          <w:b/>
+        </w:rPr>
+        <w:t xml:space="preserve">Commercial route  </w:t>
+      </w:r>
+      <w:r>
+        <w:t>Archive or protected source only; no direct sale.</w:t>
+      </w:r>
+    </w:p>
+    <w:p>
+      <w:pPr>
+        <w:keepLines/>
+      </w:pPr>
+      <w:r>
+        <w:rPr>
+          <w:b/>
+        </w:rPr>
+        <w:t xml:space="preserve">Civic Continuum role  </w:t>
+      </w:r>
+      <w:r>
+        <w:t>Portfolio support lane: preserves provenance, strengthens evidence, or supports delivery without overstating readiness.</w:t>
+      </w:r>
+    </w:p>
+    <w:p>
+      <w:pPr>
+        <w:keepLines/>
+      </w:pPr>
     </w:p>
     <w:p>
       <w:pPr>
@@ -9167,6 +10231,34 @@
       <w:pPr>
         <w:keepLines/>
       </w:pPr>
+      <w:r>
+        <w:rPr>
+          <w:b/>
+        </w:rPr>
+        <w:t xml:space="preserve">Commercial route  </w:t>
+      </w:r>
+      <w:r>
+        <w:t>Package only after audience, rights, evidence, safety, and delivery format are defined.</w:t>
+      </w:r>
+    </w:p>
+    <w:p>
+      <w:pPr>
+        <w:keepLines/>
+      </w:pPr>
+      <w:r>
+        <w:rPr>
+          <w:b/>
+        </w:rPr>
+        <w:t xml:space="preserve">Civic Continuum role  </w:t>
+      </w:r>
+      <w:r>
+        <w:t>Physical proof lane: turns claims into measured prototypes, independent review, production evidence, and useful products.</w:t>
+      </w:r>
+    </w:p>
+    <w:p>
+      <w:pPr>
+        <w:keepLines/>
+      </w:pPr>
     </w:p>
     <w:p>
       <w:pPr>
@@ -9251,6 +10343,34 @@
       <w:pPr>
         <w:keepLines/>
       </w:pPr>
+      <w:r>
+        <w:rPr>
+          <w:b/>
+        </w:rPr>
+        <w:t xml:space="preserve">Commercial route  </w:t>
+      </w:r>
+      <w:r>
+        <w:t>Edit into a rights-cleared print, ebook, audiobook, music, or serialized edition with professional copyedit and launch metadata.</w:t>
+      </w:r>
+    </w:p>
+    <w:p>
+      <w:pPr>
+        <w:keepLines/>
+      </w:pPr>
+      <w:r>
+        <w:rPr>
+          <w:b/>
+        </w:rPr>
+        <w:t xml:space="preserve">Civic Continuum role  </w:t>
+      </w:r>
+      <w:r>
+        <w:t>Public framework lane: builds the Civic Continuum case for durable guardrails, shared reality, institutional memory, and stable self-governance.</w:t>
+      </w:r>
+    </w:p>
+    <w:p>
+      <w:pPr>
+        <w:keepLines/>
+      </w:pPr>
     </w:p>
     <w:p>
       <w:pPr>
@@ -9335,6 +10455,34 @@
       <w:pPr>
         <w:keepLines/>
       </w:pPr>
+      <w:r>
+        <w:rPr>
+          <w:b/>
+        </w:rPr>
+        <w:t xml:space="preserve">Commercial route  </w:t>
+      </w:r>
+      <w:r>
+        <w:t>Edit into a rights-cleared print, ebook, audiobook, music, or serialized edition with professional copyedit and launch metadata.</w:t>
+      </w:r>
+    </w:p>
+    <w:p>
+      <w:pPr>
+        <w:keepLines/>
+      </w:pPr>
+      <w:r>
+        <w:rPr>
+          <w:b/>
+        </w:rPr>
+        <w:t xml:space="preserve">Civic Continuum role  </w:t>
+      </w:r>
+      <w:r>
+        <w:t>Public framework lane: builds the Civic Continuum case for durable guardrails, shared reality, institutional memory, and stable self-governance.</w:t>
+      </w:r>
+    </w:p>
+    <w:p>
+      <w:pPr>
+        <w:keepLines/>
+      </w:pPr>
     </w:p>
     <w:p>
       <w:pPr>
@@ -9419,6 +10567,34 @@
       <w:pPr>
         <w:keepLines/>
       </w:pPr>
+      <w:r>
+        <w:rPr>
+          <w:b/>
+        </w:rPr>
+        <w:t xml:space="preserve">Commercial route  </w:t>
+      </w:r>
+      <w:r>
+        <w:t>Publish as a sourced paper or brief; derive paid talks, workshops, consulting, licensing, or a reader-facing book only after review.</w:t>
+      </w:r>
+    </w:p>
+    <w:p>
+      <w:pPr>
+        <w:keepLines/>
+      </w:pPr>
+      <w:r>
+        <w:rPr>
+          <w:b/>
+        </w:rPr>
+        <w:t xml:space="preserve">Civic Continuum role  </w:t>
+      </w:r>
+      <w:r>
+        <w:t>Accountability practice lane: converts lived system failures into auditable methods, training, paid services, and institutional repair tools.</w:t>
+      </w:r>
+    </w:p>
+    <w:p>
+      <w:pPr>
+        <w:keepLines/>
+      </w:pPr>
     </w:p>
     <w:p>
       <w:pPr>
@@ -9503,6 +10679,34 @@
       <w:pPr>
         <w:keepLines/>
       </w:pPr>
+      <w:r>
+        <w:rPr>
+          <w:b/>
+        </w:rPr>
+        <w:t xml:space="preserve">Commercial route  </w:t>
+      </w:r>
+      <w:r>
+        <w:t>Publish as a sourced paper or brief; derive paid talks, workshops, consulting, licensing, or a reader-facing book only after review.</w:t>
+      </w:r>
+    </w:p>
+    <w:p>
+      <w:pPr>
+        <w:keepLines/>
+      </w:pPr>
+      <w:r>
+        <w:rPr>
+          <w:b/>
+        </w:rPr>
+        <w:t xml:space="preserve">Civic Continuum role  </w:t>
+      </w:r>
+      <w:r>
+        <w:t>Physical proof lane: turns claims into measured prototypes, independent review, production evidence, and useful products.</w:t>
+      </w:r>
+    </w:p>
+    <w:p>
+      <w:pPr>
+        <w:keepLines/>
+      </w:pPr>
     </w:p>
     <w:p>
       <w:pPr>
@@ -9587,6 +10791,34 @@
       <w:pPr>
         <w:keepLines/>
       </w:pPr>
+      <w:r>
+        <w:rPr>
+          <w:b/>
+        </w:rPr>
+        <w:t xml:space="preserve">Commercial route  </w:t>
+      </w:r>
+      <w:r>
+        <w:t>Publish as a sourced paper or brief; derive paid talks, workshops, consulting, licensing, or a reader-facing book only after review.</w:t>
+      </w:r>
+    </w:p>
+    <w:p>
+      <w:pPr>
+        <w:keepLines/>
+      </w:pPr>
+      <w:r>
+        <w:rPr>
+          <w:b/>
+        </w:rPr>
+        <w:t xml:space="preserve">Civic Continuum role  </w:t>
+      </w:r>
+      <w:r>
+        <w:t>Public framework lane: builds the Civic Continuum case for durable guardrails, shared reality, institutional memory, and stable self-governance.</w:t>
+      </w:r>
+    </w:p>
+    <w:p>
+      <w:pPr>
+        <w:keepLines/>
+      </w:pPr>
     </w:p>
     <w:p>
       <w:pPr>
@@ -9671,6 +10903,34 @@
       <w:pPr>
         <w:keepLines/>
       </w:pPr>
+      <w:r>
+        <w:rPr>
+          <w:b/>
+        </w:rPr>
+        <w:t xml:space="preserve">Commercial route  </w:t>
+      </w:r>
+      <w:r>
+        <w:t>Publish as a sourced paper or brief; derive paid talks, workshops, consulting, licensing, or a reader-facing book only after review.</w:t>
+      </w:r>
+    </w:p>
+    <w:p>
+      <w:pPr>
+        <w:keepLines/>
+      </w:pPr>
+      <w:r>
+        <w:rPr>
+          <w:b/>
+        </w:rPr>
+        <w:t xml:space="preserve">Civic Continuum role  </w:t>
+      </w:r>
+      <w:r>
+        <w:t>Accountability practice lane: converts lived system failures into auditable methods, training, paid services, and institutional repair tools.</w:t>
+      </w:r>
+    </w:p>
+    <w:p>
+      <w:pPr>
+        <w:keepLines/>
+      </w:pPr>
     </w:p>
     <w:p>
       <w:pPr>
@@ -9755,6 +11015,34 @@
       <w:pPr>
         <w:keepLines/>
       </w:pPr>
+      <w:r>
+        <w:rPr>
+          <w:b/>
+        </w:rPr>
+        <w:t xml:space="preserve">Commercial route  </w:t>
+      </w:r>
+      <w:r>
+        <w:t>Publish as a sourced paper or brief; derive paid talks, workshops, consulting, licensing, or a reader-facing book only after review.</w:t>
+      </w:r>
+    </w:p>
+    <w:p>
+      <w:pPr>
+        <w:keepLines/>
+      </w:pPr>
+      <w:r>
+        <w:rPr>
+          <w:b/>
+        </w:rPr>
+        <w:t xml:space="preserve">Civic Continuum role  </w:t>
+      </w:r>
+      <w:r>
+        <w:t>Physical proof lane: turns claims into measured prototypes, independent review, production evidence, and useful products.</w:t>
+      </w:r>
+    </w:p>
+    <w:p>
+      <w:pPr>
+        <w:keepLines/>
+      </w:pPr>
     </w:p>
     <w:p>
       <w:pPr>
@@ -9839,6 +11127,34 @@
       <w:pPr>
         <w:keepLines/>
       </w:pPr>
+      <w:r>
+        <w:rPr>
+          <w:b/>
+        </w:rPr>
+        <w:t xml:space="preserve">Commercial route  </w:t>
+      </w:r>
+      <w:r>
+        <w:t>Publish as a sourced paper or brief; derive paid talks, workshops, consulting, licensing, or a reader-facing book only after review.</w:t>
+      </w:r>
+    </w:p>
+    <w:p>
+      <w:pPr>
+        <w:keepLines/>
+      </w:pPr>
+      <w:r>
+        <w:rPr>
+          <w:b/>
+        </w:rPr>
+        <w:t xml:space="preserve">Civic Continuum role  </w:t>
+      </w:r>
+      <w:r>
+        <w:t>Portfolio support lane: preserves provenance, strengthens evidence, or supports delivery without overstating readiness.</w:t>
+      </w:r>
+    </w:p>
+    <w:p>
+      <w:pPr>
+        <w:keepLines/>
+      </w:pPr>
     </w:p>
     <w:p>
       <w:pPr>
@@ -9923,6 +11239,34 @@
       <w:pPr>
         <w:keepLines/>
       </w:pPr>
+      <w:r>
+        <w:rPr>
+          <w:b/>
+        </w:rPr>
+        <w:t xml:space="preserve">Commercial route  </w:t>
+      </w:r>
+      <w:r>
+        <w:t>Publish as a sourced paper or brief; derive paid talks, workshops, consulting, licensing, or a reader-facing book only after review.</w:t>
+      </w:r>
+    </w:p>
+    <w:p>
+      <w:pPr>
+        <w:keepLines/>
+      </w:pPr>
+      <w:r>
+        <w:rPr>
+          <w:b/>
+        </w:rPr>
+        <w:t xml:space="preserve">Civic Continuum role  </w:t>
+      </w:r>
+      <w:r>
+        <w:t>Accountability practice lane: converts lived system failures into auditable methods, training, paid services, and institutional repair tools.</w:t>
+      </w:r>
+    </w:p>
+    <w:p>
+      <w:pPr>
+        <w:keepLines/>
+      </w:pPr>
     </w:p>
     <w:p>
       <w:pPr>
@@ -10007,6 +11351,34 @@
       <w:pPr>
         <w:keepLines/>
       </w:pPr>
+      <w:r>
+        <w:rPr>
+          <w:b/>
+        </w:rPr>
+        <w:t xml:space="preserve">Commercial route  </w:t>
+      </w:r>
+      <w:r>
+        <w:t>Package only after audience, rights, evidence, safety, and delivery format are defined.</w:t>
+      </w:r>
+    </w:p>
+    <w:p>
+      <w:pPr>
+        <w:keepLines/>
+      </w:pPr>
+      <w:r>
+        <w:rPr>
+          <w:b/>
+        </w:rPr>
+        <w:t xml:space="preserve">Civic Continuum role  </w:t>
+      </w:r>
+      <w:r>
+        <w:t>Accountability practice lane: converts lived system failures into auditable methods, training, paid services, and institutional repair tools.</w:t>
+      </w:r>
+    </w:p>
+    <w:p>
+      <w:pPr>
+        <w:keepLines/>
+      </w:pPr>
     </w:p>
     <w:p>
       <w:pPr>
@@ -10091,6 +11463,34 @@
       <w:pPr>
         <w:keepLines/>
       </w:pPr>
+      <w:r>
+        <w:rPr>
+          <w:b/>
+        </w:rPr>
+        <w:t xml:space="preserve">Commercial route  </w:t>
+      </w:r>
+      <w:r>
+        <w:t>Publish as a sourced paper or brief; derive paid talks, workshops, consulting, licensing, or a reader-facing book only after review.</w:t>
+      </w:r>
+    </w:p>
+    <w:p>
+      <w:pPr>
+        <w:keepLines/>
+      </w:pPr>
+      <w:r>
+        <w:rPr>
+          <w:b/>
+        </w:rPr>
+        <w:t xml:space="preserve">Civic Continuum role  </w:t>
+      </w:r>
+      <w:r>
+        <w:t>Accountability practice lane: converts lived system failures into auditable methods, training, paid services, and institutional repair tools.</w:t>
+      </w:r>
+    </w:p>
+    <w:p>
+      <w:pPr>
+        <w:keepLines/>
+      </w:pPr>
     </w:p>
     <w:p>
       <w:pPr>
@@ -10175,6 +11575,34 @@
       <w:pPr>
         <w:keepLines/>
       </w:pPr>
+      <w:r>
+        <w:rPr>
+          <w:b/>
+        </w:rPr>
+        <w:t xml:space="preserve">Commercial route  </w:t>
+      </w:r>
+      <w:r>
+        <w:t>Sell as a rights-cleared workbook, facilitator kit, cohort course, institutional license, or consulting package after review and pilot evidence.</w:t>
+      </w:r>
+    </w:p>
+    <w:p>
+      <w:pPr>
+        <w:keepLines/>
+      </w:pPr>
+      <w:r>
+        <w:rPr>
+          <w:b/>
+        </w:rPr>
+        <w:t xml:space="preserve">Civic Continuum role  </w:t>
+      </w:r>
+      <w:r>
+        <w:t>Accountability practice lane: converts lived system failures into auditable methods, training, paid services, and institutional repair tools.</w:t>
+      </w:r>
+    </w:p>
+    <w:p>
+      <w:pPr>
+        <w:keepLines/>
+      </w:pPr>
     </w:p>
     <w:p>
       <w:pPr>
@@ -10259,6 +11687,34 @@
       <w:pPr>
         <w:keepLines/>
       </w:pPr>
+      <w:r>
+        <w:rPr>
+          <w:b/>
+        </w:rPr>
+        <w:t xml:space="preserve">Commercial route  </w:t>
+      </w:r>
+      <w:r>
+        <w:t>Archive or protected source only; no direct sale.</w:t>
+      </w:r>
+    </w:p>
+    <w:p>
+      <w:pPr>
+        <w:keepLines/>
+      </w:pPr>
+      <w:r>
+        <w:rPr>
+          <w:b/>
+        </w:rPr>
+        <w:t xml:space="preserve">Civic Continuum role  </w:t>
+      </w:r>
+      <w:r>
+        <w:t>Accountability practice lane: converts lived system failures into auditable methods, training, paid services, and institutional repair tools.</w:t>
+      </w:r>
+    </w:p>
+    <w:p>
+      <w:pPr>
+        <w:keepLines/>
+      </w:pPr>
     </w:p>
     <w:p>
       <w:pPr>
@@ -10343,6 +11799,34 @@
       <w:pPr>
         <w:keepLines/>
       </w:pPr>
+      <w:r>
+        <w:rPr>
+          <w:b/>
+        </w:rPr>
+        <w:t xml:space="preserve">Commercial route  </w:t>
+      </w:r>
+      <w:r>
+        <w:t>Archive or protected source only; no direct sale.</w:t>
+      </w:r>
+    </w:p>
+    <w:p>
+      <w:pPr>
+        <w:keepLines/>
+      </w:pPr>
+      <w:r>
+        <w:rPr>
+          <w:b/>
+        </w:rPr>
+        <w:t xml:space="preserve">Civic Continuum role  </w:t>
+      </w:r>
+      <w:r>
+        <w:t>Portfolio support lane: preserves provenance, strengthens evidence, or supports delivery without overstating readiness.</w:t>
+      </w:r>
+    </w:p>
+    <w:p>
+      <w:pPr>
+        <w:keepLines/>
+      </w:pPr>
     </w:p>
     <w:p>
       <w:pPr>
@@ -10427,6 +11911,34 @@
       <w:pPr>
         <w:keepLines/>
       </w:pPr>
+      <w:r>
+        <w:rPr>
+          <w:b/>
+        </w:rPr>
+        <w:t xml:space="preserve">Commercial route  </w:t>
+      </w:r>
+      <w:r>
+        <w:t>Publish as a sourced paper or brief; derive paid talks, workshops, consulting, licensing, or a reader-facing book only after review.</w:t>
+      </w:r>
+    </w:p>
+    <w:p>
+      <w:pPr>
+        <w:keepLines/>
+      </w:pPr>
+      <w:r>
+        <w:rPr>
+          <w:b/>
+        </w:rPr>
+        <w:t xml:space="preserve">Civic Continuum role  </w:t>
+      </w:r>
+      <w:r>
+        <w:t>Portfolio support lane: preserves provenance, strengthens evidence, or supports delivery without overstating readiness.</w:t>
+      </w:r>
+    </w:p>
+    <w:p>
+      <w:pPr>
+        <w:keepLines/>
+      </w:pPr>
     </w:p>
     <w:p>
       <w:pPr>
@@ -10511,6 +12023,34 @@
       <w:pPr>
         <w:keepLines/>
       </w:pPr>
+      <w:r>
+        <w:rPr>
+          <w:b/>
+        </w:rPr>
+        <w:t xml:space="preserve">Commercial route  </w:t>
+      </w:r>
+      <w:r>
+        <w:t>Package only after audience, rights, evidence, safety, and delivery format are defined.</w:t>
+      </w:r>
+    </w:p>
+    <w:p>
+      <w:pPr>
+        <w:keepLines/>
+      </w:pPr>
+      <w:r>
+        <w:rPr>
+          <w:b/>
+        </w:rPr>
+        <w:t xml:space="preserve">Civic Continuum role  </w:t>
+      </w:r>
+      <w:r>
+        <w:t>Accountability practice lane: converts lived system failures into auditable methods, training, paid services, and institutional repair tools.</w:t>
+      </w:r>
+    </w:p>
+    <w:p>
+      <w:pPr>
+        <w:keepLines/>
+      </w:pPr>
     </w:p>
     <w:p>
       <w:pPr>
@@ -10595,6 +12135,34 @@
       <w:pPr>
         <w:keepLines/>
       </w:pPr>
+      <w:r>
+        <w:rPr>
+          <w:b/>
+        </w:rPr>
+        <w:t xml:space="preserve">Commercial route  </w:t>
+      </w:r>
+      <w:r>
+        <w:t>Package only after audience, rights, evidence, safety, and delivery format are defined.</w:t>
+      </w:r>
+    </w:p>
+    <w:p>
+      <w:pPr>
+        <w:keepLines/>
+      </w:pPr>
+      <w:r>
+        <w:rPr>
+          <w:b/>
+        </w:rPr>
+        <w:t xml:space="preserve">Civic Continuum role  </w:t>
+      </w:r>
+      <w:r>
+        <w:t>Portfolio support lane: preserves provenance, strengthens evidence, or supports delivery without overstating readiness.</w:t>
+      </w:r>
+    </w:p>
+    <w:p>
+      <w:pPr>
+        <w:keepLines/>
+      </w:pPr>
     </w:p>
     <w:p>
       <w:pPr>
@@ -10679,6 +12247,34 @@
       <w:pPr>
         <w:keepLines/>
       </w:pPr>
+      <w:r>
+        <w:rPr>
+          <w:b/>
+        </w:rPr>
+        <w:t xml:space="preserve">Commercial route  </w:t>
+      </w:r>
+      <w:r>
+        <w:t>Package only after audience, rights, evidence, safety, and delivery format are defined.</w:t>
+      </w:r>
+    </w:p>
+    <w:p>
+      <w:pPr>
+        <w:keepLines/>
+      </w:pPr>
+      <w:r>
+        <w:rPr>
+          <w:b/>
+        </w:rPr>
+        <w:t xml:space="preserve">Civic Continuum role  </w:t>
+      </w:r>
+      <w:r>
+        <w:t>Public framework lane: builds the Civic Continuum case for durable guardrails, shared reality, institutional memory, and stable self-governance.</w:t>
+      </w:r>
+    </w:p>
+    <w:p>
+      <w:pPr>
+        <w:keepLines/>
+      </w:pPr>
     </w:p>
     <w:p>
       <w:pPr>
@@ -10763,6 +12359,34 @@
       <w:pPr>
         <w:keepLines/>
       </w:pPr>
+      <w:r>
+        <w:rPr>
+          <w:b/>
+        </w:rPr>
+        <w:t xml:space="preserve">Commercial route  </w:t>
+      </w:r>
+      <w:r>
+        <w:t>Package only after audience, rights, evidence, safety, and delivery format are defined.</w:t>
+      </w:r>
+    </w:p>
+    <w:p>
+      <w:pPr>
+        <w:keepLines/>
+      </w:pPr>
+      <w:r>
+        <w:rPr>
+          <w:b/>
+        </w:rPr>
+        <w:t xml:space="preserve">Civic Continuum role  </w:t>
+      </w:r>
+      <w:r>
+        <w:t>Portfolio support lane: preserves provenance, strengthens evidence, or supports delivery without overstating readiness.</w:t>
+      </w:r>
+    </w:p>
+    <w:p>
+      <w:pPr>
+        <w:keepLines/>
+      </w:pPr>
     </w:p>
     <w:p>
       <w:pPr>
@@ -10841,6 +12465,1154 @@
       </w:r>
       <w:r>
         <w:t>Operationalize the scale; predefine cases and coding rules; test counterexamples; calibrate dominant-pattern claims; verify sources; obtain historians, comparative-politics, methods, and editorial review.</w:t>
+      </w:r>
+    </w:p>
+    <w:p>
+      <w:pPr>
+        <w:keepLines/>
+      </w:pPr>
+      <w:r>
+        <w:rPr>
+          <w:b/>
+        </w:rPr>
+        <w:t xml:space="preserve">Commercial route  </w:t>
+      </w:r>
+      <w:r>
+        <w:t>Package only after audience, rights, evidence, safety, and delivery format are defined.</w:t>
+      </w:r>
+    </w:p>
+    <w:p>
+      <w:pPr>
+        <w:keepLines/>
+      </w:pPr>
+      <w:r>
+        <w:rPr>
+          <w:b/>
+        </w:rPr>
+        <w:t xml:space="preserve">Civic Continuum role  </w:t>
+      </w:r>
+      <w:r>
+        <w:t>Public framework lane: builds the Civic Continuum case for durable guardrails, shared reality, institutional memory, and stable self-governance.</w:t>
+      </w:r>
+    </w:p>
+    <w:p>
+      <w:pPr>
+        <w:keepLines/>
+      </w:pPr>
+    </w:p>
+    <w:p>
+      <w:pPr>
+        <w:pStyle w:val="Heading2"/>
+        <w:keepLines/>
+      </w:pPr>
+      <w:r>
+        <w:t>60. How to Fix Us — A Systems-Level Treatment Framework for Stable Self-Governance</w:t>
+      </w:r>
+    </w:p>
+    <w:p>
+      <w:pPr>
+        <w:keepLines/>
+      </w:pPr>
+      <w:r>
+        <w:rPr>
+          <w:b/>
+        </w:rPr>
+        <w:t xml:space="preserve">Type  </w:t>
+      </w:r>
+      <w:r>
+        <w:t>Civilizational systems book and policy framework</w:t>
+      </w:r>
+    </w:p>
+    <w:p>
+      <w:pPr>
+        <w:keepLines/>
+      </w:pPr>
+      <w:r>
+        <w:rPr>
+          <w:b/>
+        </w:rPr>
+        <w:t xml:space="preserve">Release disposition  </w:t>
+      </w:r>
+      <w:r>
+        <w:t>Public book and policy-brief candidate after source and governance review</w:t>
+      </w:r>
+    </w:p>
+    <w:p>
+      <w:pPr>
+        <w:keepLines/>
+      </w:pPr>
+      <w:r>
+        <w:rPr>
+          <w:b/>
+        </w:rPr>
+        <w:t xml:space="preserve">Zenodo match  </w:t>
+      </w:r>
+      <w:r>
+        <w:t>Paired treatment volume within the human-sanity and civilizational-maturity family</w:t>
+      </w:r>
+    </w:p>
+    <w:p>
+      <w:pPr>
+        <w:keepLines/>
+      </w:pPr>
+      <w:r>
+        <w:rPr>
+          <w:b/>
+        </w:rPr>
+        <w:t xml:space="preserve">Working description  </w:t>
+      </w:r>
+      <w:r>
+        <w:t>A five-shift treatment framework centered on durable guardrails, power constraints, structural memory, design for human flaws, and rejection of savior narratives.</w:t>
+      </w:r>
+    </w:p>
+    <w:p>
+      <w:pPr>
+        <w:keepLines/>
+      </w:pPr>
+      <w:r>
+        <w:rPr>
+          <w:b/>
+        </w:rPr>
+        <w:t xml:space="preserve">Next evidence gate  </w:t>
+      </w:r>
+      <w:r>
+        <w:t>Merge duplicated Part II material; verify every source and policy example; distinguish normative proposals from tested interventions; add implementation, objections, tradeoffs, and jurisdictional limits; obtain governance, constitutional-law, economics, history, and editorial review.</w:t>
+      </w:r>
+    </w:p>
+    <w:p>
+      <w:pPr>
+        <w:keepLines/>
+      </w:pPr>
+      <w:r>
+        <w:rPr>
+          <w:b/>
+        </w:rPr>
+        <w:t xml:space="preserve">Commercial route  </w:t>
+      </w:r>
+      <w:r>
+        <w:t>Edit into a rights-cleared print, ebook, audiobook, music, or serialized edition with professional copyedit and launch metadata.</w:t>
+      </w:r>
+    </w:p>
+    <w:p>
+      <w:pPr>
+        <w:keepLines/>
+      </w:pPr>
+      <w:r>
+        <w:rPr>
+          <w:b/>
+        </w:rPr>
+        <w:t xml:space="preserve">Civic Continuum role  </w:t>
+      </w:r>
+      <w:r>
+        <w:t>Public framework lane: builds the Civic Continuum case for durable guardrails, shared reality, institutional memory, and stable self-governance.</w:t>
+      </w:r>
+    </w:p>
+    <w:p>
+      <w:pPr>
+        <w:keepLines/>
+      </w:pPr>
+    </w:p>
+    <w:p>
+      <w:pPr>
+        <w:pStyle w:val="Heading2"/>
+        <w:keepLines/>
+      </w:pPr>
+      <w:r>
+        <w:t>61. WTF Is Wrong With Us — A Systems-Level Analysis of Human Sanity, Risk, and Self-Regulation</w:t>
+      </w:r>
+    </w:p>
+    <w:p>
+      <w:pPr>
+        <w:keepLines/>
+      </w:pPr>
+      <w:r>
+        <w:rPr>
+          <w:b/>
+        </w:rPr>
+        <w:t xml:space="preserve">Type  </w:t>
+      </w:r>
+      <w:r>
+        <w:t>Civilizational systems book and research essay</w:t>
+      </w:r>
+    </w:p>
+    <w:p>
+      <w:pPr>
+        <w:keepLines/>
+      </w:pPr>
+      <w:r>
+        <w:rPr>
+          <w:b/>
+        </w:rPr>
+        <w:t xml:space="preserve">Release disposition  </w:t>
+      </w:r>
+      <w:r>
+        <w:t>Public book candidate after evidence, tone, and mental-health sensitivity review</w:t>
+      </w:r>
+    </w:p>
+    <w:p>
+      <w:pPr>
+        <w:keepLines/>
+      </w:pPr>
+      <w:r>
+        <w:rPr>
+          <w:b/>
+        </w:rPr>
+        <w:t xml:space="preserve">Zenodo match  </w:t>
+      </w:r>
+      <w:r>
+        <w:t>Diagnosis volume paired with How to Fix Us</w:t>
+      </w:r>
+    </w:p>
+    <w:p>
+      <w:pPr>
+        <w:keepLines/>
+      </w:pPr>
+      <w:r>
+        <w:rPr>
+          <w:b/>
+        </w:rPr>
+        <w:t xml:space="preserve">Working description  </w:t>
+      </w:r>
+      <w:r>
+        <w:t>An evidence-informed diagnosis of recurring collective self-harm, institutional abstraction, risk amplification, reform relapse, and the gap between technical power and ethical constraint.</w:t>
+      </w:r>
+    </w:p>
+    <w:p>
+      <w:pPr>
+        <w:keepLines/>
+      </w:pPr>
+      <w:r>
+        <w:rPr>
+          <w:b/>
+        </w:rPr>
+        <w:t xml:space="preserve">Next evidence gate  </w:t>
+      </w:r>
+      <w:r>
+        <w:t>Remove dialogue scaffolding and clinical-sounding species diagnosis unless clearly metaphorical; verify all citations; define the sanity index as an illustrative model; add counterevidence and limitations; obtain psychology, history, systems, risk, and editorial review.</w:t>
+      </w:r>
+    </w:p>
+    <w:p>
+      <w:pPr>
+        <w:keepLines/>
+      </w:pPr>
+      <w:r>
+        <w:rPr>
+          <w:b/>
+        </w:rPr>
+        <w:t xml:space="preserve">Commercial route  </w:t>
+      </w:r>
+      <w:r>
+        <w:t>Edit into a rights-cleared print, ebook, audiobook, music, or serialized edition with professional copyedit and launch metadata.</w:t>
+      </w:r>
+    </w:p>
+    <w:p>
+      <w:pPr>
+        <w:keepLines/>
+      </w:pPr>
+      <w:r>
+        <w:rPr>
+          <w:b/>
+        </w:rPr>
+        <w:t xml:space="preserve">Civic Continuum role  </w:t>
+      </w:r>
+      <w:r>
+        <w:t>Public framework lane: builds the Civic Continuum case for durable guardrails, shared reality, institutional memory, and stable self-governance.</w:t>
+      </w:r>
+    </w:p>
+    <w:p>
+      <w:pPr>
+        <w:keepLines/>
+      </w:pPr>
+    </w:p>
+    <w:p>
+      <w:pPr>
+        <w:pStyle w:val="Heading2"/>
+        <w:keepLines/>
+      </w:pPr>
+      <w:r>
+        <w:t>62. Aliens^.^.docx</w:t>
+      </w:r>
+    </w:p>
+    <w:p>
+      <w:pPr>
+        <w:keepLines/>
+      </w:pPr>
+      <w:r>
+        <w:rPr>
+          <w:b/>
+        </w:rPr>
+        <w:t xml:space="preserve">Type  </w:t>
+      </w:r>
+      <w:r>
+        <w:t>Raw developmental conversation and source notebook</w:t>
+      </w:r>
+    </w:p>
+    <w:p>
+      <w:pPr>
+        <w:keepLines/>
+      </w:pPr>
+      <w:r>
+        <w:rPr>
+          <w:b/>
+        </w:rPr>
+        <w:t xml:space="preserve">Release disposition  </w:t>
+      </w:r>
+      <w:r>
+        <w:t>Private source material; not market-ready</w:t>
+      </w:r>
+    </w:p>
+    <w:p>
+      <w:pPr>
+        <w:keepLines/>
+      </w:pPr>
+      <w:r>
+        <w:rPr>
+          <w:b/>
+        </w:rPr>
+        <w:t xml:space="preserve">Zenodo match  </w:t>
+      </w:r>
+      <w:r>
+        <w:t>Support source for the human-sanity and treatment volumes; not a separate work count</w:t>
+      </w:r>
+    </w:p>
+    <w:p>
+      <w:pPr>
+        <w:keepLines/>
+      </w:pPr>
+      <w:r>
+        <w:rPr>
+          <w:b/>
+        </w:rPr>
+        <w:t xml:space="preserve">Working description  </w:t>
+      </w:r>
+      <w:r>
+        <w:t>A long exploratory dialogue about alien metaphors, inhuman systems, civilizational risk, grounded reality testing, grief, accountability, and treatment frameworks.</w:t>
+      </w:r>
+    </w:p>
+    <w:p>
+      <w:pPr>
+        <w:keepLines/>
+      </w:pPr>
+      <w:r>
+        <w:rPr>
+          <w:b/>
+        </w:rPr>
+        <w:t xml:space="preserve">Next evidence gate  </w:t>
+      </w:r>
+      <w:r>
+        <w:t>Do not publish the raw conversation; extract original arguments with provenance; remove assistant-generated repetition and private material; retain grounded distinctions; use only as a controlled source notebook for the paired books.</w:t>
+      </w:r>
+    </w:p>
+    <w:p>
+      <w:pPr>
+        <w:keepLines/>
+      </w:pPr>
+      <w:r>
+        <w:rPr>
+          <w:b/>
+        </w:rPr>
+        <w:t xml:space="preserve">Commercial route  </w:t>
+      </w:r>
+      <w:r>
+        <w:t>Archive or protected source only; no direct sale.</w:t>
+      </w:r>
+    </w:p>
+    <w:p>
+      <w:pPr>
+        <w:keepLines/>
+      </w:pPr>
+      <w:r>
+        <w:rPr>
+          <w:b/>
+        </w:rPr>
+        <w:t xml:space="preserve">Civic Continuum role  </w:t>
+      </w:r>
+      <w:r>
+        <w:t>Audience and revenue lane: funds the mission, teaches the framework, and builds trust through useful rights-cleared products.</w:t>
+      </w:r>
+    </w:p>
+    <w:p>
+      <w:pPr>
+        <w:keepLines/>
+      </w:pPr>
+    </w:p>
+    <w:p>
+      <w:pPr>
+        <w:pStyle w:val="Heading2"/>
+        <w:keepLines/>
+      </w:pPr>
+      <w:r>
+        <w:t>63. Starfleet Academy — Division of Governance, Systems Integrity and Accountability</w:t>
+      </w:r>
+    </w:p>
+    <w:p>
+      <w:pPr>
+        <w:keepLines/>
+      </w:pPr>
+      <w:r>
+        <w:rPr>
+          <w:b/>
+        </w:rPr>
+        <w:t xml:space="preserve">Type  </w:t>
+      </w:r>
+      <w:r>
+        <w:t>Expanded fiction-framed curriculum, workbook, and capstone system</w:t>
+      </w:r>
+    </w:p>
+    <w:p>
+      <w:pPr>
+        <w:keepLines/>
+      </w:pPr>
+      <w:r>
+        <w:rPr>
+          <w:b/>
+        </w:rPr>
+        <w:t xml:space="preserve">Release disposition  </w:t>
+      </w:r>
+      <w:r>
+        <w:t>Rights-restricted educational product; rights-cleared original edition recommended</w:t>
+      </w:r>
+    </w:p>
+    <w:p>
+      <w:pPr>
+        <w:keepLines/>
+      </w:pPr>
+      <w:r>
+        <w:rPr>
+          <w:b/>
+        </w:rPr>
+        <w:t xml:space="preserve">Zenodo match  </w:t>
+      </w:r>
+      <w:r>
+        <w:t>Expanded component of the existing Starfleet Academy lineage; not a separate work count</w:t>
+      </w:r>
+    </w:p>
+    <w:p>
+      <w:pPr>
+        <w:keepLines/>
+      </w:pPr>
+      <w:r>
+        <w:rPr>
+          <w:b/>
+        </w:rPr>
+        <w:t xml:space="preserve">Working description  </w:t>
+      </w:r>
+      <w:r>
+        <w:t>A multi-volume governance and accountability program with course syllabi, labs, simulations, workbooks, worksheets, capstone defense, binder system, and accessibility-oriented progress tools.</w:t>
+      </w:r>
+    </w:p>
+    <w:p>
+      <w:pPr>
+        <w:keepLines/>
+      </w:pPr>
+      <w:r>
+        <w:rPr>
+          <w:b/>
+        </w:rPr>
+        <w:t xml:space="preserve">Next evidence gate  </w:t>
+      </w:r>
+      <w:r>
+        <w:t>Separate original pedagogy from Star Trek and other third-party characters and marks; remove fictional accreditation/transcript claims; verify readings; perform curriculum, accessibility, legal, rights, and assessment review; publish a renamed original academy edition.</w:t>
+      </w:r>
+    </w:p>
+    <w:p>
+      <w:pPr>
+        <w:keepLines/>
+      </w:pPr>
+      <w:r>
+        <w:rPr>
+          <w:b/>
+        </w:rPr>
+        <w:t xml:space="preserve">Commercial route  </w:t>
+      </w:r>
+      <w:r>
+        <w:t>Sell as a rights-cleared workbook, facilitator kit, cohort course, institutional license, or consulting package after review and pilot evidence.</w:t>
+      </w:r>
+    </w:p>
+    <w:p>
+      <w:pPr>
+        <w:keepLines/>
+      </w:pPr>
+      <w:r>
+        <w:rPr>
+          <w:b/>
+        </w:rPr>
+        <w:t xml:space="preserve">Civic Continuum role  </w:t>
+      </w:r>
+      <w:r>
+        <w:t>Audience and revenue lane: funds the mission, teaches the framework, and builds trust through useful rights-cleared products.</w:t>
+      </w:r>
+    </w:p>
+    <w:p>
+      <w:pPr>
+        <w:keepLines/>
+      </w:pPr>
+    </w:p>
+    <w:p>
+      <w:pPr>
+        <w:pStyle w:val="Heading2"/>
+        <w:keepLines/>
+      </w:pPr>
+      <w:r>
+        <w:t>64. Accounting Curriculum Lab 3 — Clean Ledger Skeleton</w:t>
+      </w:r>
+    </w:p>
+    <w:p>
+      <w:pPr>
+        <w:keepLines/>
+      </w:pPr>
+      <w:r>
+        <w:rPr>
+          <w:b/>
+        </w:rPr>
+        <w:t xml:space="preserve">Type  </w:t>
+      </w:r>
+      <w:r>
+        <w:t>Workbook lab and accounting-control template</w:t>
+      </w:r>
+    </w:p>
+    <w:p>
+      <w:pPr>
+        <w:keepLines/>
+      </w:pPr>
+      <w:r>
+        <w:rPr>
+          <w:b/>
+        </w:rPr>
+        <w:t xml:space="preserve">Release disposition  </w:t>
+      </w:r>
+      <w:r>
+        <w:t>Private training component; sanitized template can be sold</w:t>
+      </w:r>
+    </w:p>
+    <w:p>
+      <w:pPr>
+        <w:keepLines/>
+      </w:pPr>
+      <w:r>
+        <w:rPr>
+          <w:b/>
+        </w:rPr>
+        <w:t xml:space="preserve">Zenodo match  </w:t>
+      </w:r>
+      <w:r>
+        <w:t>Component of the Harm Without Awareness curriculum; not a separate work count</w:t>
+      </w:r>
+    </w:p>
+    <w:p>
+      <w:pPr>
+        <w:keepLines/>
+      </w:pPr>
+      <w:r>
+        <w:rPr>
+          <w:b/>
+        </w:rPr>
+        <w:t xml:space="preserve">Working description  </w:t>
+      </w:r>
+      <w:r>
+        <w:t>A zero-entry monthly ledger skeleton, artifact index, permissioning rules, balance-control formula, and freeze logic for unresolved discrepancies.</w:t>
+      </w:r>
+    </w:p>
+    <w:p>
+      <w:pPr>
+        <w:keepLines/>
+      </w:pPr>
+      <w:r>
+        <w:rPr>
+          <w:b/>
+        </w:rPr>
+        <w:t xml:space="preserve">Next evidence gate  </w:t>
+      </w:r>
+      <w:r>
+        <w:t>Correct grammar and conversational residue; validate accounting treatment of reversals and opening balances; replace illustrative records with clearly fictional examples; have an accountant, housing-law reviewer, and curriculum designer test the template.</w:t>
+      </w:r>
+    </w:p>
+    <w:p>
+      <w:pPr>
+        <w:keepLines/>
+      </w:pPr>
+      <w:r>
+        <w:rPr>
+          <w:b/>
+        </w:rPr>
+        <w:t xml:space="preserve">Commercial route  </w:t>
+      </w:r>
+      <w:r>
+        <w:t>Sell as a rights-cleared workbook, facilitator kit, cohort course, institutional license, or consulting package after review and pilot evidence.</w:t>
+      </w:r>
+    </w:p>
+    <w:p>
+      <w:pPr>
+        <w:keepLines/>
+      </w:pPr>
+      <w:r>
+        <w:rPr>
+          <w:b/>
+        </w:rPr>
+        <w:t xml:space="preserve">Civic Continuum role  </w:t>
+      </w:r>
+      <w:r>
+        <w:t>Accountability practice lane: converts lived system failures into auditable methods, training, paid services, and institutional repair tools.</w:t>
+      </w:r>
+    </w:p>
+    <w:p>
+      <w:pPr>
+        <w:keepLines/>
+      </w:pPr>
+    </w:p>
+    <w:p>
+      <w:pPr>
+        <w:pStyle w:val="Heading2"/>
+        <w:keepLines/>
+      </w:pPr>
+      <w:r>
+        <w:t>65. Harm Without Awareness — Training Modules for Others</w:t>
+      </w:r>
+    </w:p>
+    <w:p>
+      <w:pPr>
+        <w:keepLines/>
+      </w:pPr>
+      <w:r>
+        <w:rPr>
+          <w:b/>
+        </w:rPr>
+        <w:t xml:space="preserve">Type  </w:t>
+      </w:r>
+      <w:r>
+        <w:t>Professional training-track architecture</w:t>
+      </w:r>
+    </w:p>
+    <w:p>
+      <w:pPr>
+        <w:keepLines/>
+      </w:pPr>
+      <w:r>
+        <w:rPr>
+          <w:b/>
+        </w:rPr>
+        <w:t xml:space="preserve">Release disposition  </w:t>
+      </w:r>
+      <w:r>
+        <w:t>Commercial curriculum component after source, legal, and pedagogy review</w:t>
+      </w:r>
+    </w:p>
+    <w:p>
+      <w:pPr>
+        <w:keepLines/>
+      </w:pPr>
+      <w:r>
+        <w:rPr>
+          <w:b/>
+        </w:rPr>
+        <w:t xml:space="preserve">Zenodo match  </w:t>
+      </w:r>
+      <w:r>
+        <w:t>Component of the STSAE and Harm Without Awareness curriculum family; not a separate work count</w:t>
+      </w:r>
+    </w:p>
+    <w:p>
+      <w:pPr>
+        <w:keepLines/>
+      </w:pPr>
+      <w:r>
+        <w:rPr>
+          <w:b/>
+        </w:rPr>
+        <w:t xml:space="preserve">Working description  </w:t>
+      </w:r>
+      <w:r>
+        <w:t>Three audience-tiered tracks for tenants and frontline advocates, investigators and compliance staff, and policy or audit leadership, each with applied capstones.</w:t>
+      </w:r>
+    </w:p>
+    <w:p>
+      <w:pPr>
+        <w:keepLines/>
+      </w:pPr>
+      <w:r>
+        <w:rPr>
+          <w:b/>
+        </w:rPr>
+        <w:t xml:space="preserve">Next evidence gate  </w:t>
+      </w:r>
+      <w:r>
+        <w:t>Expand objectives, lesson plans, facilitator notes, timing, assessments, accessibility, trauma-aware safeguards, jurisdictional disclaimers, and evaluation metrics; pilot with compensated community reviewers.</w:t>
+      </w:r>
+    </w:p>
+    <w:p>
+      <w:pPr>
+        <w:keepLines/>
+      </w:pPr>
+      <w:r>
+        <w:rPr>
+          <w:b/>
+        </w:rPr>
+        <w:t xml:space="preserve">Commercial route  </w:t>
+      </w:r>
+      <w:r>
+        <w:t>Sell as a rights-cleared workbook, facilitator kit, cohort course, institutional license, or consulting package after review and pilot evidence.</w:t>
+      </w:r>
+    </w:p>
+    <w:p>
+      <w:pPr>
+        <w:keepLines/>
+      </w:pPr>
+      <w:r>
+        <w:rPr>
+          <w:b/>
+        </w:rPr>
+        <w:t xml:space="preserve">Civic Continuum role  </w:t>
+      </w:r>
+      <w:r>
+        <w:t>Accountability practice lane: converts lived system failures into auditable methods, training, paid services, and institutional repair tools.</w:t>
+      </w:r>
+    </w:p>
+    <w:p>
+      <w:pPr>
+        <w:keepLines/>
+      </w:pPr>
+    </w:p>
+    <w:p>
+      <w:pPr>
+        <w:pStyle w:val="Heading2"/>
+        <w:keepLines/>
+      </w:pPr>
+      <w:r>
+        <w:t>66. When Enforcement Outruns Accounting</w:t>
+      </w:r>
+    </w:p>
+    <w:p>
+      <w:pPr>
+        <w:keepLines/>
+      </w:pPr>
+      <w:r>
+        <w:rPr>
+          <w:b/>
+        </w:rPr>
+        <w:t xml:space="preserve">Type  </w:t>
+      </w:r>
+      <w:r>
+        <w:t>Housing accountability case study and professional training anchor</w:t>
+      </w:r>
+    </w:p>
+    <w:p>
+      <w:pPr>
+        <w:keepLines/>
+      </w:pPr>
+      <w:r>
+        <w:rPr>
+          <w:b/>
+        </w:rPr>
+        <w:t xml:space="preserve">Release disposition  </w:t>
+      </w:r>
+      <w:r>
+        <w:t>Strictly private case version; de-identified publication candidate</w:t>
+      </w:r>
+    </w:p>
+    <w:p>
+      <w:pPr>
+        <w:keepLines/>
+      </w:pPr>
+      <w:r>
+        <w:rPr>
+          <w:b/>
+        </w:rPr>
+        <w:t xml:space="preserve">Zenodo match  </w:t>
+      </w:r>
+      <w:r>
+        <w:t>Case-study component of the existing ledger-accountability family; not a separate work count</w:t>
+      </w:r>
+    </w:p>
+    <w:p>
+      <w:pPr>
+        <w:keepLines/>
+      </w:pPr>
+      <w:r>
+        <w:rPr>
+          <w:b/>
+        </w:rPr>
+        <w:t xml:space="preserve">Working description  </w:t>
+      </w:r>
+      <w:r>
+        <w:t>A document-based analysis of enforcement continuing despite disputed accounting, acknowledged rent-calculation errors, repayment-agreement questions, and third-party funding requirements.</w:t>
+      </w:r>
+    </w:p>
+    <w:p>
+      <w:pPr>
+        <w:keepLines/>
+      </w:pPr>
+      <w:r>
+        <w:rPr>
+          <w:b/>
+        </w:rPr>
+        <w:t xml:space="preserve">Next evidence gate  </w:t>
+      </w:r>
+      <w:r>
+        <w:t>Preserve the protected evidence separately; verify every case fact and quotation with counsel; distinguish allegation, admission, inference, and recommendation; produce a rigorously de-identified teaching case before publication.</w:t>
+      </w:r>
+    </w:p>
+    <w:p>
+      <w:pPr>
+        <w:keepLines/>
+      </w:pPr>
+      <w:r>
+        <w:rPr>
+          <w:b/>
+        </w:rPr>
+        <w:t xml:space="preserve">Commercial route  </w:t>
+      </w:r>
+      <w:r>
+        <w:t>Sell as a rights-cleared workbook, facilitator kit, cohort course, institutional license, or consulting package after review and pilot evidence.</w:t>
+      </w:r>
+    </w:p>
+    <w:p>
+      <w:pPr>
+        <w:keepLines/>
+      </w:pPr>
+      <w:r>
+        <w:rPr>
+          <w:b/>
+        </w:rPr>
+        <w:t xml:space="preserve">Civic Continuum role  </w:t>
+      </w:r>
+      <w:r>
+        <w:t>Accountability practice lane: converts lived system failures into auditable methods, training, paid services, and institutional repair tools.</w:t>
+      </w:r>
+    </w:p>
+    <w:p>
+      <w:pPr>
+        <w:keepLines/>
+      </w:pPr>
+    </w:p>
+    <w:p>
+      <w:pPr>
+        <w:pStyle w:val="Heading2"/>
+        <w:keepLines/>
+      </w:pPr>
+      <w:r>
+        <w:t>67. Human Dignity Is the Byproduct</w:t>
+      </w:r>
+    </w:p>
+    <w:p>
+      <w:pPr>
+        <w:keepLines/>
+      </w:pPr>
+      <w:r>
+        <w:rPr>
+          <w:b/>
+        </w:rPr>
+        <w:t xml:space="preserve">Type  </w:t>
+      </w:r>
+      <w:r>
+        <w:t>Housing operations and incentive-design policy paper</w:t>
+      </w:r>
+    </w:p>
+    <w:p>
+      <w:pPr>
+        <w:keepLines/>
+      </w:pPr>
+      <w:r>
+        <w:rPr>
+          <w:b/>
+        </w:rPr>
+        <w:t xml:space="preserve">Release disposition  </w:t>
+      </w:r>
+      <w:r>
+        <w:t>Public policy-brief and consulting candidate after evidence review</w:t>
+      </w:r>
+    </w:p>
+    <w:p>
+      <w:pPr>
+        <w:keepLines/>
+      </w:pPr>
+      <w:r>
+        <w:rPr>
+          <w:b/>
+        </w:rPr>
+        <w:t xml:space="preserve">Zenodo match  </w:t>
+      </w:r>
+      <w:r>
+        <w:t>No match in the recovered 60-record set</w:t>
+      </w:r>
+    </w:p>
+    <w:p>
+      <w:pPr>
+        <w:keepLines/>
+      </w:pPr>
+      <w:r>
+        <w:rPr>
+          <w:b/>
+        </w:rPr>
+        <w:t xml:space="preserve">Working description  </w:t>
+      </w:r>
+      <w:r>
+        <w:t>An incentive-design argument that ledger clarity, early resolution, verified accounting, and outcome-based performance can improve both institutional results and resident dignity.</w:t>
+      </w:r>
+    </w:p>
+    <w:p>
+      <w:pPr>
+        <w:keepLines/>
+      </w:pPr>
+      <w:r>
+        <w:rPr>
+          <w:b/>
+        </w:rPr>
+        <w:t xml:space="preserve">Next evidence gate  </w:t>
+      </w:r>
+      <w:r>
+        <w:t>Test financial and behavioral claims; replace absolutes with measurable hypotheses; add cost model, metrics, failure cases, labor implications, and implementation plan; obtain housing operations, finance, labor, legal, tenant, and editorial review.</w:t>
+      </w:r>
+    </w:p>
+    <w:p>
+      <w:pPr>
+        <w:keepLines/>
+      </w:pPr>
+      <w:r>
+        <w:rPr>
+          <w:b/>
+        </w:rPr>
+        <w:t xml:space="preserve">Commercial route  </w:t>
+      </w:r>
+      <w:r>
+        <w:t>Publish as a sourced paper or brief; derive paid talks, workshops, consulting, licensing, or a reader-facing book only after review.</w:t>
+      </w:r>
+    </w:p>
+    <w:p>
+      <w:pPr>
+        <w:keepLines/>
+      </w:pPr>
+      <w:r>
+        <w:rPr>
+          <w:b/>
+        </w:rPr>
+        <w:t xml:space="preserve">Civic Continuum role  </w:t>
+      </w:r>
+      <w:r>
+        <w:t>Accountability practice lane: converts lived system failures into auditable methods, training, paid services, and institutional repair tools.</w:t>
+      </w:r>
+    </w:p>
+    <w:p>
+      <w:pPr>
+        <w:keepLines/>
+      </w:pPr>
+    </w:p>
+    <w:p>
+      <w:pPr>
+        <w:pStyle w:val="Heading2"/>
+        <w:keepLines/>
+      </w:pPr>
+      <w:r>
+        <w:t>68. Socio-Technical Systems Accountability Engineer — Harm Without Awareness</w:t>
+      </w:r>
+    </w:p>
+    <w:p>
+      <w:pPr>
+        <w:keepLines/>
+      </w:pPr>
+      <w:r>
+        <w:rPr>
+          <w:b/>
+        </w:rPr>
+        <w:t xml:space="preserve">Type  </w:t>
+      </w:r>
+      <w:r>
+        <w:t>Professional field manual, curriculum, and service methodology</w:t>
+      </w:r>
+    </w:p>
+    <w:p>
+      <w:pPr>
+        <w:keepLines/>
+      </w:pPr>
+      <w:r>
+        <w:rPr>
+          <w:b/>
+        </w:rPr>
+        <w:t xml:space="preserve">Release disposition  </w:t>
+      </w:r>
+      <w:r>
+        <w:t>Flagship commercial training and consulting candidate after completion and review</w:t>
+      </w:r>
+    </w:p>
+    <w:p>
+      <w:pPr>
+        <w:keepLines/>
+      </w:pPr>
+      <w:r>
+        <w:rPr>
+          <w:b/>
+        </w:rPr>
+        <w:t xml:space="preserve">Zenodo match  </w:t>
+      </w:r>
+      <w:r>
+        <w:t>Canonical candidate for the STSAE and Harm Without Awareness family</w:t>
+      </w:r>
+    </w:p>
+    <w:p>
+      <w:pPr>
+        <w:keepLines/>
+      </w:pPr>
+      <w:r>
+        <w:rPr>
+          <w:b/>
+        </w:rPr>
+        <w:t xml:space="preserve">Working description  </w:t>
+      </w:r>
+      <w:r>
+        <w:t>A field manual defining the accountability-engineer role, artifact-based analysis, mechanism and effect statements, structural maps, counter-documentation, counter-design, and a twelve-week curriculum.</w:t>
+      </w:r>
+    </w:p>
+    <w:p>
+      <w:pPr>
+        <w:keepLines/>
+      </w:pPr>
+      <w:r>
+        <w:rPr>
+          <w:b/>
+        </w:rPr>
+        <w:t xml:space="preserve">Next evidence gate  </w:t>
+      </w:r>
+      <w:r>
+        <w:t>Replace all placeholder sections marked unchanged; remove chat residue and unsupported universal claims; verify scholarship; add worked examples, assessment rubrics, ethics, scope-of-practice, accessibility, and legal boundaries; pilot the method and document outcomes.</w:t>
+      </w:r>
+    </w:p>
+    <w:p>
+      <w:pPr>
+        <w:keepLines/>
+      </w:pPr>
+      <w:r>
+        <w:rPr>
+          <w:b/>
+        </w:rPr>
+        <w:t xml:space="preserve">Commercial route  </w:t>
+      </w:r>
+      <w:r>
+        <w:t>Sell as a rights-cleared workbook, facilitator kit, cohort course, institutional license, or consulting package after review and pilot evidence.</w:t>
+      </w:r>
+    </w:p>
+    <w:p>
+      <w:pPr>
+        <w:keepLines/>
+      </w:pPr>
+      <w:r>
+        <w:rPr>
+          <w:b/>
+        </w:rPr>
+        <w:t xml:space="preserve">Civic Continuum role  </w:t>
+      </w:r>
+      <w:r>
+        <w:t>Accountability practice lane: converts lived system failures into auditable methods, training, paid services, and institutional repair tools.</w:t>
+      </w:r>
+    </w:p>
+    <w:p>
+      <w:pPr>
+        <w:keepLines/>
+      </w:pPr>
+    </w:p>
+    <w:p>
+      <w:pPr>
+        <w:pStyle w:val="Heading2"/>
+        <w:keepLines/>
+      </w:pPr>
+      <w:r>
+        <w:t>69. The Batman Training Protocol and Productivity System</w:t>
+      </w:r>
+    </w:p>
+    <w:p>
+      <w:pPr>
+        <w:keepLines/>
+      </w:pPr>
+      <w:r>
+        <w:rPr>
+          <w:b/>
+        </w:rPr>
+        <w:t xml:space="preserve">Type  </w:t>
+      </w:r>
+      <w:r>
+        <w:t>Consumer fitness and productivity planner</w:t>
+      </w:r>
+    </w:p>
+    <w:p>
+      <w:pPr>
+        <w:keepLines/>
+      </w:pPr>
+      <w:r>
+        <w:rPr>
+          <w:b/>
+        </w:rPr>
+        <w:t xml:space="preserve">Release disposition  </w:t>
+      </w:r>
+      <w:r>
+        <w:t>Rights-restricted draft; sell only as a renamed original system after safety review</w:t>
+      </w:r>
+    </w:p>
+    <w:p>
+      <w:pPr>
+        <w:keepLines/>
+      </w:pPr>
+      <w:r>
+        <w:rPr>
+          <w:b/>
+        </w:rPr>
+        <w:t xml:space="preserve">Zenodo match  </w:t>
+      </w:r>
+      <w:r>
+        <w:t>No match in the recovered 60-record set</w:t>
+      </w:r>
+    </w:p>
+    <w:p>
+      <w:pPr>
+        <w:keepLines/>
+      </w:pPr>
+      <w:r>
+        <w:rPr>
+          <w:b/>
+        </w:rPr>
+        <w:t xml:space="preserve">Working description  </w:t>
+      </w:r>
+      <w:r>
+        <w:t>A themed weekly conditioning schedule, six productivity protocols, and daily readiness checklist combining exercise, logging, environment design, reminders, and minimum viable progress.</w:t>
+      </w:r>
+    </w:p>
+    <w:p>
+      <w:pPr>
+        <w:keepLines/>
+      </w:pPr>
+      <w:r>
+        <w:rPr>
+          <w:b/>
+        </w:rPr>
+        <w:t xml:space="preserve">Next evidence gate  </w:t>
+      </w:r>
+      <w:r>
+        <w:t>Remove Batman, Batcave, Oracle, Gotham, and related marks from a commercial edition; add progressive levels, rest, screening, injury modification, nutrition and sleep boundaries; eliminate unsafe intensity assumptions; obtain certified trainer, sports-medicine, accessibility, and rights review.</w:t>
+      </w:r>
+    </w:p>
+    <w:p>
+      <w:pPr>
+        <w:keepLines/>
+      </w:pPr>
+      <w:r>
+        <w:rPr>
+          <w:b/>
+        </w:rPr>
+        <w:t xml:space="preserve">Commercial route  </w:t>
+      </w:r>
+      <w:r>
+        <w:t>Sell as a rights-cleared workbook, facilitator kit, cohort course, institutional license, or consulting package after review and pilot evidence.</w:t>
+      </w:r>
+    </w:p>
+    <w:p>
+      <w:pPr>
+        <w:keepLines/>
+      </w:pPr>
+      <w:r>
+        <w:rPr>
+          <w:b/>
+        </w:rPr>
+        <w:t xml:space="preserve">Civic Continuum role  </w:t>
+      </w:r>
+      <w:r>
+        <w:t>Audience and revenue lane: funds the mission, teaches the framework, and builds trust through useful rights-cleared products.</w:t>
       </w:r>
     </w:p>
     <w:p>

</xml_diff>